<commit_message>
bunch of stuff, cleaning up first 3 pages and file renames
</commit_message>
<xml_diff>
--- a/docs/outline.docx
+++ b/docs/outline.docx
@@ -4,14 +4,68 @@
   <w:body>
     <w:p>
       <w:pPr>
-        <w:spacing w:after="0" w:line="276" w:lineRule="auto"/>
-      </w:pPr>
-      <w:r>
+        <w:spacing w:after="0"/>
         <w:rPr>
           <w:b/>
           <w:bCs/>
         </w:rPr>
-        <w:t>Tab 1 - Basic Rankine Cycle</w:t>
+      </w:pPr>
+      <w:r>
+        <w:rPr>
+          <w:b/>
+          <w:bCs/>
+        </w:rPr>
+        <w:t>(Note that none of the wording here is set in stone but I want to lay out the general structure. Feel free to improve it)</w:t>
+      </w:r>
+    </w:p>
+    <w:p>
+      <w:pPr>
+        <w:spacing w:after="0"/>
+        <w:rPr>
+          <w:b/>
+          <w:bCs/>
+        </w:rPr>
+      </w:pPr>
+      <w:r>
+        <w:rPr>
+          <w:b/>
+          <w:bCs/>
+        </w:rPr>
+        <w:t>NOT EVERYTHING I SAY IS LIKELY TO BE ACCURATE. IMPORTANT TO FACT CHECK.</w:t>
+      </w:r>
+    </w:p>
+    <w:p>
+      <w:pPr>
+        <w:spacing w:after="0"/>
+        <w:rPr>
+          <w:b/>
+          <w:bCs/>
+        </w:rPr>
+      </w:pPr>
+      <w:r>
+        <w:rPr>
+          <w:b/>
+          <w:bCs/>
+        </w:rPr>
+        <w:t>DON’T LITERALLY NAME THE TABS TAB 1, 2, 3,...</w:t>
+      </w:r>
+    </w:p>
+    <w:p>
+      <w:pPr>
+        <w:spacing w:after="0"/>
+        <w:rPr>
+          <w:b/>
+          <w:bCs/>
+          <w:color w:val="A02B93" w:themeColor="accent5"/>
+        </w:rPr>
+      </w:pPr>
+      <w:r>
+        <w:rPr>
+          <w:b/>
+          <w:bCs/>
+          <w:color w:val="A02B93" w:themeColor="accent5"/>
+        </w:rPr>
+        <w:t>Home</w:t>
       </w:r>
     </w:p>
     <w:p>
@@ -20,10 +74,22 @@
           <w:ilvl w:val="0"/>
           <w:numId w:val="1"/>
         </w:numPr>
-        <w:spacing w:after="0" w:line="276" w:lineRule="auto"/>
-      </w:pPr>
-      <w:r>
-        <w:t>Explain why the Rankine cycle is used</w:t>
+        <w:spacing w:after="0"/>
+      </w:pPr>
+      <w:r>
+        <w:t>Welcome to my website about the Rankine cycle in the context of nuclear energy!</w:t>
+      </w:r>
+    </w:p>
+    <w:p>
+      <w:pPr>
+        <w:numPr>
+          <w:ilvl w:val="0"/>
+          <w:numId w:val="1"/>
+        </w:numPr>
+        <w:spacing w:after="0"/>
+      </w:pPr>
+      <w:r>
+        <w:t>Point of the website</w:t>
       </w:r>
     </w:p>
     <w:p>
@@ -32,10 +98,10 @@
           <w:ilvl w:val="1"/>
           <w:numId w:val="2"/>
         </w:numPr>
-        <w:spacing w:after="0" w:line="276" w:lineRule="auto"/>
-      </w:pPr>
-      <w:r>
-        <w:t>Need a way to convert heat energy to rotational motion for the generator, which converts that motion to electricity</w:t>
+        <w:spacing w:after="0"/>
+      </w:pPr>
+      <w:r>
+        <w:t>Wanted to highlight the structure of the Rankine cycle used in the context of nuclear energy and provide interactive components that allow the user to adjust things in ideal Rankine cycles like pump power, heat in, extraction fraction, and time of year to see how messing with these things affects the power output and efficiency of the cycle</w:t>
       </w:r>
     </w:p>
     <w:p>
@@ -44,10 +110,10 @@
           <w:ilvl w:val="1"/>
           <w:numId w:val="3"/>
         </w:numPr>
-        <w:spacing w:after="0" w:line="276" w:lineRule="auto"/>
-      </w:pPr>
-      <w:r>
-        <w:t>Why use water?</w:t>
+        <w:spacing w:after="0"/>
+      </w:pPr>
+      <w:r>
+        <w:t>Built for thermodynamics students who want to dive deeper into the cycle that powers so much of the world, who want to do more than manually flip through steam tables on homework and exams</w:t>
       </w:r>
     </w:p>
     <w:p>
@@ -56,22 +122,34 @@
           <w:ilvl w:val="1"/>
           <w:numId w:val="4"/>
         </w:numPr>
-        <w:spacing w:after="0" w:line="276" w:lineRule="auto"/>
-      </w:pPr>
-      <w:r>
-        <w:t>Can some Rankine cycles not use water?</w:t>
-      </w:r>
-    </w:p>
-    <w:p>
-      <w:pPr>
-        <w:numPr>
-          <w:ilvl w:val="2"/>
+        <w:spacing w:after="0"/>
+      </w:pPr>
+      <w:r>
+        <w:t>All T-s diagrams use NIST steam table data and standard linear interpolation. Formulas derived in your thermo classes are used for all calculations</w:t>
+      </w:r>
+    </w:p>
+    <w:p>
+      <w:pPr>
+        <w:numPr>
+          <w:ilvl w:val="0"/>
+          <w:numId w:val="1"/>
+        </w:numPr>
+        <w:spacing w:after="0"/>
+      </w:pPr>
+      <w:r>
+        <w:t>Introduce myself</w:t>
+      </w:r>
+    </w:p>
+    <w:p>
+      <w:pPr>
+        <w:numPr>
+          <w:ilvl w:val="1"/>
           <w:numId w:val="5"/>
         </w:numPr>
-        <w:spacing w:after="0" w:line="276" w:lineRule="auto"/>
-      </w:pPr>
-      <w:r>
-        <w:t>Yes!</w:t>
+        <w:spacing w:after="0"/>
+      </w:pPr>
+      <w:r>
+        <w:t>I’m Adam Heiler. I am a student at the University of Michigan. I am passionate about clean energy and thermodynamics. I have taken Introduction to Thermodynamics (ME 235), Advanced Energy Solutions (ME 433), and Advanced Thermodynamics (ME 336) here at Michigan. I interned at Nine Mile Point Nuclear Station in Oswego, NY for two summers at a Strategic/Systems Engineering Intern</w:t>
       </w:r>
     </w:p>
     <w:p>
@@ -80,22 +158,22 @@
           <w:ilvl w:val="1"/>
           <w:numId w:val="6"/>
         </w:numPr>
-        <w:spacing w:after="0" w:line="276" w:lineRule="auto"/>
-      </w:pPr>
-      <w:r>
-        <w:t>Called a thermal power plant</w:t>
-      </w:r>
-    </w:p>
-    <w:p>
-      <w:pPr>
-        <w:numPr>
-          <w:ilvl w:val="1"/>
+        <w:spacing w:after="0"/>
+      </w:pPr>
+      <w:r>
+        <w:t>Some interesting facts about Nine Mile Point</w:t>
+      </w:r>
+    </w:p>
+    <w:p>
+      <w:pPr>
+        <w:numPr>
+          <w:ilvl w:val="2"/>
           <w:numId w:val="7"/>
         </w:numPr>
-        <w:spacing w:after="0" w:line="276" w:lineRule="auto"/>
-      </w:pPr>
-      <w:r>
-        <w:t>Used by:</w:t>
+        <w:spacing w:after="0"/>
+      </w:pPr>
+      <w:r>
+        <w:t>Unit 1 is the oldest operating nuclear reactor in the United States</w:t>
       </w:r>
     </w:p>
     <w:p>
@@ -104,10 +182,10 @@
           <w:ilvl w:val="2"/>
           <w:numId w:val="8"/>
         </w:numPr>
-        <w:spacing w:after="0" w:line="276" w:lineRule="auto"/>
-      </w:pPr>
-      <w:r>
-        <w:t>Nuclear Fission (both BWRs and PWRs)</w:t>
+        <w:spacing w:after="0"/>
+      </w:pPr>
+      <w:r>
+        <w:t>Unit 1 and Unit 2 are both GE boiling water reactors, but they are extremely different, dissimilar</w:t>
       </w:r>
     </w:p>
     <w:p>
@@ -116,22 +194,22 @@
           <w:ilvl w:val="3"/>
           <w:numId w:val="9"/>
         </w:numPr>
-        <w:spacing w:after="0" w:line="276" w:lineRule="auto"/>
-      </w:pPr>
-      <w:r>
-        <w:t>Explain the difference between BWRs and PWRs</w:t>
-      </w:r>
-    </w:p>
-    <w:p>
-      <w:pPr>
-        <w:numPr>
-          <w:ilvl w:val="3"/>
+        <w:spacing w:after="0"/>
+      </w:pPr>
+      <w:r>
+        <w:t>Unit 1 is a GE BWR-2 without a cooling tower, and Unit 2 is a GE BWR-5 with a cooling tower and a much higher power output</w:t>
+      </w:r>
+    </w:p>
+    <w:p>
+      <w:pPr>
+        <w:numPr>
+          <w:ilvl w:val="2"/>
           <w:numId w:val="10"/>
         </w:numPr>
-        <w:spacing w:after="0" w:line="276" w:lineRule="auto"/>
-      </w:pPr>
-      <w:r>
-        <w:t>Link to learn more</w:t>
+        <w:spacing w:after="0"/>
+      </w:pPr>
+      <w:r>
+        <w:t>Nine Mile Point is the first nuclear facility in the United States to generate clean hydrogen through electrolysis, mainly used for generator cooling</w:t>
       </w:r>
     </w:p>
     <w:p>
@@ -140,186 +218,261 @@
           <w:ilvl w:val="2"/>
           <w:numId w:val="11"/>
         </w:numPr>
-        <w:spacing w:after="0" w:line="276" w:lineRule="auto"/>
-      </w:pPr>
-      <w:r>
-        <w:t>Coal</w:t>
-      </w:r>
-    </w:p>
-    <w:p>
-      <w:pPr>
-        <w:numPr>
-          <w:ilvl w:val="3"/>
+        <w:spacing w:after="0"/>
+      </w:pPr>
+      <w:r>
+        <w:t>There is another nuclear power plant just next door, FitzPatrick, which is a GE BWR-4</w:t>
+      </w:r>
+    </w:p>
+    <w:p>
+      <w:pPr>
+        <w:spacing w:after="0"/>
+      </w:pPr>
+    </w:p>
+    <w:p>
+      <w:pPr>
+        <w:spacing w:after="0"/>
+        <w:rPr>
+          <w:b/>
+          <w:bCs/>
+          <w:color w:val="A02B93" w:themeColor="accent5"/>
+        </w:rPr>
+      </w:pPr>
+      <w:r>
+        <w:rPr>
+          <w:b/>
+          <w:bCs/>
+          <w:color w:val="A02B93" w:themeColor="accent5"/>
+        </w:rPr>
+        <w:t>Thermodynamics Concepts to Know</w:t>
+      </w:r>
+    </w:p>
+    <w:p>
+      <w:pPr>
+        <w:numPr>
+          <w:ilvl w:val="0"/>
           <w:numId w:val="12"/>
         </w:numPr>
-        <w:spacing w:after="0" w:line="276" w:lineRule="auto"/>
-      </w:pPr>
-      <w:r>
-        <w:t xml:space="preserve">Why </w:t>
-      </w:r>
-      <w:proofErr w:type="gramStart"/>
-      <w:r>
-        <w:t>coal is</w:t>
-      </w:r>
-      <w:proofErr w:type="gramEnd"/>
-      <w:r>
-        <w:t xml:space="preserve"> dying (good)</w:t>
-      </w:r>
-    </w:p>
-    <w:p>
-      <w:pPr>
-        <w:numPr>
-          <w:ilvl w:val="3"/>
+        <w:spacing w:after="0"/>
+      </w:pPr>
+      <w:r>
+        <w:t>Give equations</w:t>
+      </w:r>
+    </w:p>
+    <w:p>
+      <w:pPr>
+        <w:numPr>
+          <w:ilvl w:val="0"/>
           <w:numId w:val="13"/>
         </w:numPr>
-        <w:spacing w:after="0" w:line="276" w:lineRule="auto"/>
-      </w:pPr>
-      <w:r>
-        <w:t>Link to learn more about dying coal</w:t>
+        <w:spacing w:after="0"/>
+      </w:pPr>
+      <w:r>
+        <w:lastRenderedPageBreak/>
+        <w:t>Enthalpy, entropy, energy equation…etc.</w:t>
+      </w:r>
+    </w:p>
+    <w:p>
+      <w:pPr>
+        <w:numPr>
+          <w:ilvl w:val="0"/>
+          <w:numId w:val="13"/>
+        </w:numPr>
+        <w:spacing w:after="0"/>
+      </w:pPr>
+      <w:r>
+        <w:t>Exergy and second law efficiency</w:t>
+      </w:r>
+    </w:p>
+    <w:p>
+      <w:pPr>
+        <w:numPr>
+          <w:ilvl w:val="1"/>
+          <w:numId w:val="14"/>
+        </w:numPr>
+        <w:spacing w:after="0"/>
+      </w:pPr>
+      <w:r>
+        <w:t>Talk more about these concepts because introductory thermodynamics courses often don’t cover them at all</w:t>
+      </w:r>
+    </w:p>
+    <w:p>
+      <w:pPr>
+        <w:numPr>
+          <w:ilvl w:val="1"/>
+          <w:numId w:val="15"/>
+        </w:numPr>
+        <w:spacing w:after="0"/>
+      </w:pPr>
+      <w:r>
+        <w:t>Exergy is the amount of energy that can actually be used to produce work</w:t>
+      </w:r>
+    </w:p>
+    <w:p>
+      <w:pPr>
+        <w:numPr>
+          <w:ilvl w:val="1"/>
+          <w:numId w:val="16"/>
+        </w:numPr>
+        <w:spacing w:after="0"/>
+      </w:pPr>
+      <w:r>
+        <w:t>The rest is called irreversibility, and goes hand-in-hand with entropy generation</w:t>
+      </w:r>
+    </w:p>
+    <w:p>
+      <w:pPr>
+        <w:numPr>
+          <w:ilvl w:val="1"/>
+          <w:numId w:val="17"/>
+        </w:numPr>
+        <w:spacing w:after="0"/>
+      </w:pPr>
+      <w:r>
+        <w:t>First law efficiency is misleading, because a 100% efficient heat engine is literally impossible. I tend to prefer second law efficiency, which considers the efficiency of a process at converting all exergy input (energy input that can actually be used to produce work) to work. A perfectly revereible Carnot cycle (give a link), for example, is 100% efficiency when it comes to second law efficiency.</w:t>
+      </w:r>
+    </w:p>
+    <w:p>
+      <w:pPr>
+        <w:numPr>
+          <w:ilvl w:val="0"/>
+          <w:numId w:val="13"/>
+        </w:numPr>
+        <w:spacing w:after="0"/>
+      </w:pPr>
+      <w:r>
+        <w:t>Give links for all the concepts so students can touch up on them, especially for exergy and second law efficiency</w:t>
+      </w:r>
+    </w:p>
+    <w:p>
+      <w:pPr>
+        <w:spacing w:after="0"/>
+      </w:pPr>
+    </w:p>
+    <w:p>
+      <w:pPr>
+        <w:spacing w:after="0"/>
+        <w:rPr>
+          <w:b/>
+          <w:bCs/>
+          <w:color w:val="A02B93" w:themeColor="accent5"/>
+        </w:rPr>
+      </w:pPr>
+      <w:r>
+        <w:rPr>
+          <w:b/>
+          <w:bCs/>
+          <w:color w:val="A02B93" w:themeColor="accent5"/>
+        </w:rPr>
+        <w:t>Why the Rankine Cycle?</w:t>
+      </w:r>
+    </w:p>
+    <w:p>
+      <w:pPr>
+        <w:numPr>
+          <w:ilvl w:val="0"/>
+          <w:numId w:val="18"/>
+        </w:numPr>
+        <w:spacing w:after="0"/>
+      </w:pPr>
+      <w:r>
+        <w:t>Explain what the point of the Rankine cycle is</w:t>
+      </w:r>
+    </w:p>
+    <w:p>
+      <w:pPr>
+        <w:numPr>
+          <w:ilvl w:val="0"/>
+          <w:numId w:val="18"/>
+        </w:numPr>
+        <w:spacing w:after="0"/>
+      </w:pPr>
+      <w:r>
+        <w:t>Explain why the Rankine cycle is used</w:t>
+      </w:r>
+    </w:p>
+    <w:p>
+      <w:pPr>
+        <w:numPr>
+          <w:ilvl w:val="1"/>
+          <w:numId w:val="19"/>
+        </w:numPr>
+        <w:spacing w:after="0"/>
+      </w:pPr>
+      <w:r>
+        <w:t>Need a way to convert heat energy to rotational motion for the generator, which converts that motion to electricity</w:t>
+      </w:r>
+    </w:p>
+    <w:p>
+      <w:pPr>
+        <w:numPr>
+          <w:ilvl w:val="1"/>
+          <w:numId w:val="20"/>
+        </w:numPr>
+        <w:spacing w:after="0"/>
+      </w:pPr>
+      <w:r>
+        <w:t>Often simplified to “boiling water to spin a turbine,” which pretty much is the core point of it</w:t>
+      </w:r>
+    </w:p>
+    <w:p>
+      <w:pPr>
+        <w:numPr>
+          <w:ilvl w:val="1"/>
+          <w:numId w:val="21"/>
+        </w:numPr>
+        <w:spacing w:after="0"/>
+      </w:pPr>
+      <w:r>
+        <w:t>Why use water?</w:t>
+      </w:r>
+    </w:p>
+    <w:p>
+      <w:pPr>
+        <w:numPr>
+          <w:ilvl w:val="1"/>
+          <w:numId w:val="22"/>
+        </w:numPr>
+        <w:spacing w:after="0"/>
+      </w:pPr>
+      <w:r>
+        <w:t>Can some Rankine cycles not use water?</w:t>
       </w:r>
     </w:p>
     <w:p>
       <w:pPr>
         <w:numPr>
           <w:ilvl w:val="2"/>
-          <w:numId w:val="14"/>
-        </w:numPr>
-        <w:spacing w:after="0" w:line="276" w:lineRule="auto"/>
-      </w:pPr>
-      <w:r>
-        <w:t>Oil</w:t>
-      </w:r>
-    </w:p>
-    <w:p>
-      <w:pPr>
-        <w:numPr>
-          <w:ilvl w:val="3"/>
-          <w:numId w:val="15"/>
-        </w:numPr>
-        <w:spacing w:after="0" w:line="276" w:lineRule="auto"/>
-      </w:pPr>
-      <w:r>
-        <w:t>Oswego oil plant for example (also home to three boiling water reactors, two of which belong to Nine Mile Points)</w:t>
-      </w:r>
-    </w:p>
-    <w:p>
-      <w:pPr>
-        <w:numPr>
-          <w:ilvl w:val="3"/>
-          <w:numId w:val="16"/>
-        </w:numPr>
-        <w:spacing w:after="0" w:line="276" w:lineRule="auto"/>
-      </w:pPr>
-      <w:r>
-        <w:t>Link to learn more about dying oil</w:t>
-      </w:r>
-    </w:p>
-    <w:p>
-      <w:pPr>
-        <w:numPr>
-          <w:ilvl w:val="2"/>
-          <w:numId w:val="17"/>
-        </w:numPr>
-        <w:spacing w:after="0" w:line="276" w:lineRule="auto"/>
-      </w:pPr>
-      <w:r>
-        <w:t>Natural Gas Combined Cycle (which also uses the Brayton cycle)</w:t>
-      </w:r>
-    </w:p>
-    <w:p>
-      <w:pPr>
-        <w:numPr>
-          <w:ilvl w:val="3"/>
-          <w:numId w:val="18"/>
-        </w:numPr>
-        <w:spacing w:after="0" w:line="276" w:lineRule="auto"/>
-      </w:pPr>
-      <w:r>
-        <w:t>Link to learn more</w:t>
-      </w:r>
-    </w:p>
-    <w:p>
-      <w:pPr>
-        <w:numPr>
-          <w:ilvl w:val="2"/>
-          <w:numId w:val="19"/>
-        </w:numPr>
-        <w:spacing w:after="0" w:line="276" w:lineRule="auto"/>
-      </w:pPr>
-      <w:r>
-        <w:t>Concentrated Solar (CSP)</w:t>
-      </w:r>
-    </w:p>
-    <w:p>
-      <w:pPr>
-        <w:numPr>
-          <w:ilvl w:val="3"/>
-          <w:numId w:val="20"/>
-        </w:numPr>
-        <w:spacing w:after="0" w:line="276" w:lineRule="auto"/>
-      </w:pPr>
-      <w:r>
-        <w:t>Collects heat energy from the sun</w:t>
-      </w:r>
-    </w:p>
-    <w:p>
-      <w:pPr>
-        <w:numPr>
-          <w:ilvl w:val="3"/>
-          <w:numId w:val="21"/>
-        </w:numPr>
-        <w:spacing w:after="0" w:line="276" w:lineRule="auto"/>
-      </w:pPr>
-      <w:r>
-        <w:t>Tower, dish (most common), and trough</w:t>
-      </w:r>
-    </w:p>
-    <w:p>
-      <w:pPr>
-        <w:numPr>
-          <w:ilvl w:val="3"/>
-          <w:numId w:val="22"/>
-        </w:numPr>
-        <w:spacing w:after="0" w:line="276" w:lineRule="auto"/>
-      </w:pPr>
-      <w:r>
-        <w:t>Not photovoltaic</w:t>
-      </w:r>
-    </w:p>
-    <w:p>
-      <w:pPr>
-        <w:numPr>
-          <w:ilvl w:val="3"/>
           <w:numId w:val="23"/>
         </w:numPr>
-        <w:spacing w:after="0" w:line="276" w:lineRule="auto"/>
-      </w:pPr>
-      <w:r>
-        <w:t>Link to learn more about concentrated solar</w:t>
-      </w:r>
-    </w:p>
-    <w:p>
-      <w:pPr>
-        <w:numPr>
-          <w:ilvl w:val="2"/>
+        <w:spacing w:after="0"/>
+      </w:pPr>
+      <w:r>
+        <w:t>Yes!</w:t>
+      </w:r>
+    </w:p>
+    <w:p>
+      <w:pPr>
+        <w:numPr>
+          <w:ilvl w:val="1"/>
           <w:numId w:val="24"/>
         </w:numPr>
-        <w:spacing w:after="0" w:line="276" w:lineRule="auto"/>
-      </w:pPr>
-      <w:r>
-        <w:t>Geothermal</w:t>
-      </w:r>
-    </w:p>
-    <w:p>
-      <w:pPr>
-        <w:numPr>
-          <w:ilvl w:val="3"/>
+        <w:spacing w:after="0"/>
+      </w:pPr>
+      <w:r>
+        <w:t>Called a thermal power plant</w:t>
+      </w:r>
+    </w:p>
+    <w:p>
+      <w:pPr>
+        <w:numPr>
+          <w:ilvl w:val="1"/>
           <w:numId w:val="25"/>
         </w:numPr>
-        <w:spacing w:after="0" w:line="276" w:lineRule="auto"/>
-      </w:pPr>
-      <w:r>
-        <w:t>Link to learn more</w:t>
+        <w:spacing w:after="0"/>
+      </w:pPr>
+      <w:r>
+        <w:t>Used by:</w:t>
       </w:r>
     </w:p>
     <w:p>
@@ -328,10 +481,10 @@
           <w:ilvl w:val="2"/>
           <w:numId w:val="26"/>
         </w:numPr>
-        <w:spacing w:after="0" w:line="276" w:lineRule="auto"/>
-      </w:pPr>
-      <w:r>
-        <w:t>Waste heat recovery plants</w:t>
+        <w:spacing w:after="0"/>
+      </w:pPr>
+      <w:r>
+        <w:t>Nuclear Fission (both BWRs and PWRs)</w:t>
       </w:r>
     </w:p>
     <w:p>
@@ -340,22 +493,22 @@
           <w:ilvl w:val="3"/>
           <w:numId w:val="27"/>
         </w:numPr>
-        <w:spacing w:after="0" w:line="276" w:lineRule="auto"/>
+        <w:spacing w:after="0"/>
+      </w:pPr>
+      <w:r>
+        <w:t>Explain the difference between BWRs and PWRs</w:t>
+      </w:r>
+    </w:p>
+    <w:p>
+      <w:pPr>
+        <w:numPr>
+          <w:ilvl w:val="3"/>
+          <w:numId w:val="28"/>
+        </w:numPr>
+        <w:spacing w:after="0"/>
       </w:pPr>
       <w:r>
         <w:t>Link to learn more</w:t>
-      </w:r>
-    </w:p>
-    <w:p>
-      <w:pPr>
-        <w:numPr>
-          <w:ilvl w:val="2"/>
-          <w:numId w:val="28"/>
-        </w:numPr>
-        <w:spacing w:after="0" w:line="276" w:lineRule="auto"/>
-      </w:pPr>
-      <w:r>
-        <w:t>Nuclear Fusion (some cases)</w:t>
       </w:r>
     </w:p>
     <w:p>
@@ -364,22 +517,22 @@
           <w:ilvl w:val="3"/>
           <w:numId w:val="29"/>
         </w:numPr>
-        <w:spacing w:after="0" w:line="276" w:lineRule="auto"/>
-      </w:pPr>
-      <w:r>
-        <w:t>Commonwealth Fusion System’s tokamak design, ARC, will use the Rankine cycle</w:t>
-      </w:r>
-    </w:p>
-    <w:p>
-      <w:pPr>
-        <w:numPr>
-          <w:ilvl w:val="3"/>
+        <w:spacing w:after="0"/>
+      </w:pPr>
+      <w:r>
+        <w:t>Include ‘fission’ picture</w:t>
+      </w:r>
+    </w:p>
+    <w:p>
+      <w:pPr>
+        <w:numPr>
+          <w:ilvl w:val="2"/>
           <w:numId w:val="30"/>
         </w:numPr>
-        <w:spacing w:after="0" w:line="276" w:lineRule="auto"/>
-      </w:pPr>
-      <w:r>
-        <w:t>Link to CFS website</w:t>
+        <w:spacing w:after="0"/>
+      </w:pPr>
+      <w:r>
+        <w:t>Nuclear Fusion (some cases)</w:t>
       </w:r>
     </w:p>
     <w:p>
@@ -388,10 +541,10 @@
           <w:ilvl w:val="3"/>
           <w:numId w:val="31"/>
         </w:numPr>
-        <w:spacing w:after="0" w:line="276" w:lineRule="auto"/>
-      </w:pPr>
-      <w:r>
-        <w:t>Helion Energy plans to directly convert the magnetic field from the fusion reaction to electricity, hoping to bypass the Rankine cycle</w:t>
+        <w:spacing w:after="0"/>
+      </w:pPr>
+      <w:r>
+        <w:t>Commonwealth Fusion System’s tokamak design, ARC, will use the Rankine cycle</w:t>
       </w:r>
     </w:p>
     <w:p>
@@ -400,7 +553,32 @@
           <w:ilvl w:val="3"/>
           <w:numId w:val="32"/>
         </w:numPr>
-        <w:spacing w:after="0" w:line="276" w:lineRule="auto"/>
+        <w:spacing w:after="0"/>
+      </w:pPr>
+      <w:r>
+        <w:t>Link to CFS website</w:t>
+      </w:r>
+    </w:p>
+    <w:p>
+      <w:pPr>
+        <w:numPr>
+          <w:ilvl w:val="3"/>
+          <w:numId w:val="33"/>
+        </w:numPr>
+        <w:spacing w:after="0"/>
+      </w:pPr>
+      <w:r>
+        <w:lastRenderedPageBreak/>
+        <w:t>Helion Energy plans to directly convert the magnetic field from the fusion reaction to electricity, hoping to bypass the Rankine cycle</w:t>
+      </w:r>
+    </w:p>
+    <w:p>
+      <w:pPr>
+        <w:numPr>
+          <w:ilvl w:val="3"/>
+          <w:numId w:val="34"/>
+        </w:numPr>
+        <w:spacing w:after="0"/>
       </w:pPr>
       <w:r>
         <w:t>Link to Helion Energy website</w:t>
@@ -409,149 +587,374 @@
     <w:p>
       <w:pPr>
         <w:numPr>
-          <w:ilvl w:val="0"/>
-          <w:numId w:val="1"/>
-        </w:numPr>
-        <w:spacing w:after="0" w:line="276" w:lineRule="auto"/>
-      </w:pPr>
-      <w:r>
-        <w:lastRenderedPageBreak/>
-        <w:t>Thermodynamics knowledge you should know</w:t>
-      </w:r>
-    </w:p>
-    <w:p>
-      <w:pPr>
-        <w:numPr>
-          <w:ilvl w:val="0"/>
-          <w:numId w:val="1"/>
-        </w:numPr>
-        <w:spacing w:after="0" w:line="276" w:lineRule="auto"/>
-      </w:pPr>
-      <w:r>
-        <w:t>Overview of Basic Rankine Cycle</w:t>
+          <w:ilvl w:val="3"/>
+          <w:numId w:val="35"/>
+        </w:numPr>
+        <w:spacing w:after="0"/>
+      </w:pPr>
+      <w:r>
+        <w:t>Include ‘fusion’ picture</w:t>
+      </w:r>
+    </w:p>
+    <w:p>
+      <w:pPr>
+        <w:numPr>
+          <w:ilvl w:val="2"/>
+          <w:numId w:val="36"/>
+        </w:numPr>
+        <w:spacing w:after="0"/>
+      </w:pPr>
+      <w:r>
+        <w:t>Coal</w:t>
+      </w:r>
+    </w:p>
+    <w:p>
+      <w:pPr>
+        <w:numPr>
+          <w:ilvl w:val="3"/>
+          <w:numId w:val="37"/>
+        </w:numPr>
+        <w:spacing w:after="0"/>
+      </w:pPr>
+      <w:r>
+        <w:t>Why coal is dying (good)</w:t>
+      </w:r>
+    </w:p>
+    <w:p>
+      <w:pPr>
+        <w:numPr>
+          <w:ilvl w:val="3"/>
+          <w:numId w:val="38"/>
+        </w:numPr>
+        <w:spacing w:after="0"/>
+      </w:pPr>
+      <w:r>
+        <w:t>Link to learn more about dying coal</w:t>
+      </w:r>
+    </w:p>
+    <w:p>
+      <w:pPr>
+        <w:numPr>
+          <w:ilvl w:val="3"/>
+          <w:numId w:val="39"/>
+        </w:numPr>
+        <w:spacing w:after="0"/>
+      </w:pPr>
+      <w:r>
+        <w:t>Include </w:t>
+      </w:r>
+    </w:p>
+    <w:p>
+      <w:pPr>
+        <w:numPr>
+          <w:ilvl w:val="2"/>
+          <w:numId w:val="40"/>
+        </w:numPr>
+        <w:spacing w:after="0"/>
+      </w:pPr>
+      <w:r>
+        <w:t>Oil</w:t>
+      </w:r>
+    </w:p>
+    <w:p>
+      <w:pPr>
+        <w:numPr>
+          <w:ilvl w:val="3"/>
+          <w:numId w:val="41"/>
+        </w:numPr>
+        <w:spacing w:after="0"/>
+      </w:pPr>
+      <w:r>
+        <w:t>Oswego oil plant for example (also home to three boiling water reactors, two of which belong to Nine Mile Points)</w:t>
+      </w:r>
+    </w:p>
+    <w:p>
+      <w:pPr>
+        <w:numPr>
+          <w:ilvl w:val="3"/>
+          <w:numId w:val="42"/>
+        </w:numPr>
+        <w:spacing w:after="0"/>
+      </w:pPr>
+      <w:r>
+        <w:t>Link to learn more about dying oil</w:t>
+      </w:r>
+    </w:p>
+    <w:p>
+      <w:pPr>
+        <w:numPr>
+          <w:ilvl w:val="2"/>
+          <w:numId w:val="43"/>
+        </w:numPr>
+        <w:spacing w:after="0"/>
+      </w:pPr>
+      <w:r>
+        <w:t>Natural Gas Combined Cycle (which also uses the Brayton cycle)</w:t>
+      </w:r>
+    </w:p>
+    <w:p>
+      <w:pPr>
+        <w:numPr>
+          <w:ilvl w:val="3"/>
+          <w:numId w:val="44"/>
+        </w:numPr>
+        <w:spacing w:after="0"/>
+      </w:pPr>
+      <w:r>
+        <w:t>Link to learn more</w:t>
+      </w:r>
+    </w:p>
+    <w:p>
+      <w:pPr>
+        <w:numPr>
+          <w:ilvl w:val="2"/>
+          <w:numId w:val="45"/>
+        </w:numPr>
+        <w:spacing w:after="0"/>
+      </w:pPr>
+      <w:r>
+        <w:t>Concentrated Solar (CSP)</w:t>
+      </w:r>
+    </w:p>
+    <w:p>
+      <w:pPr>
+        <w:numPr>
+          <w:ilvl w:val="3"/>
+          <w:numId w:val="46"/>
+        </w:numPr>
+        <w:spacing w:after="0"/>
+      </w:pPr>
+      <w:r>
+        <w:t>Collects heat energy from the sun</w:t>
+      </w:r>
+    </w:p>
+    <w:p>
+      <w:pPr>
+        <w:numPr>
+          <w:ilvl w:val="3"/>
+          <w:numId w:val="47"/>
+        </w:numPr>
+        <w:spacing w:after="0"/>
+      </w:pPr>
+      <w:r>
+        <w:t>Tower, dish (most common), and trough</w:t>
+      </w:r>
+    </w:p>
+    <w:p>
+      <w:pPr>
+        <w:numPr>
+          <w:ilvl w:val="3"/>
+          <w:numId w:val="48"/>
+        </w:numPr>
+        <w:spacing w:after="0"/>
+      </w:pPr>
+      <w:r>
+        <w:t>Not photovoltaic</w:t>
+      </w:r>
+    </w:p>
+    <w:p>
+      <w:pPr>
+        <w:numPr>
+          <w:ilvl w:val="3"/>
+          <w:numId w:val="49"/>
+        </w:numPr>
+        <w:spacing w:after="0"/>
+      </w:pPr>
+      <w:r>
+        <w:t>Link to learn more about concentrated solar</w:t>
+      </w:r>
+    </w:p>
+    <w:p>
+      <w:pPr>
+        <w:numPr>
+          <w:ilvl w:val="2"/>
+          <w:numId w:val="50"/>
+        </w:numPr>
+        <w:spacing w:after="0"/>
+      </w:pPr>
+      <w:r>
+        <w:t>Geothermal</w:t>
+      </w:r>
+    </w:p>
+    <w:p>
+      <w:pPr>
+        <w:numPr>
+          <w:ilvl w:val="3"/>
+          <w:numId w:val="51"/>
+        </w:numPr>
+        <w:spacing w:after="0"/>
+      </w:pPr>
+      <w:r>
+        <w:t>Link to learn more</w:t>
+      </w:r>
+    </w:p>
+    <w:p>
+      <w:pPr>
+        <w:numPr>
+          <w:ilvl w:val="2"/>
+          <w:numId w:val="52"/>
+        </w:numPr>
+        <w:spacing w:after="0"/>
+      </w:pPr>
+      <w:r>
+        <w:t>Waste heat recovery plants</w:t>
       </w:r>
     </w:p>
     <w:p>
       <w:pPr>
         <w:numPr>
           <w:ilvl w:val="1"/>
-          <w:numId w:val="33"/>
-        </w:numPr>
-        <w:spacing w:after="0" w:line="276" w:lineRule="auto"/>
-      </w:pPr>
-      <w:r>
-        <w:t>Intended for thermodynamics I students (ME 235 at the University of Michigan)</w:t>
+          <w:numId w:val="53"/>
+        </w:numPr>
+        <w:spacing w:after="0"/>
+      </w:pPr>
+      <w:r>
+        <w:t>So let’s jump into the technical aspects of the Rankine cycle</w:t>
       </w:r>
     </w:p>
     <w:p>
       <w:pPr>
         <w:numPr>
           <w:ilvl w:val="1"/>
-          <w:numId w:val="34"/>
-        </w:numPr>
-        <w:spacing w:after="0" w:line="276" w:lineRule="auto"/>
-      </w:pPr>
-      <w:r>
-        <w:t>1 → 2 Pump (explain)</w:t>
-      </w:r>
-    </w:p>
-    <w:p>
-      <w:pPr>
-        <w:numPr>
-          <w:ilvl w:val="1"/>
-          <w:numId w:val="35"/>
-        </w:numPr>
-        <w:spacing w:after="0" w:line="276" w:lineRule="auto"/>
-      </w:pPr>
-      <w:r>
-        <w:t>2 → 3 Boiler (explain)</w:t>
-      </w:r>
-    </w:p>
-    <w:p>
-      <w:pPr>
-        <w:numPr>
-          <w:ilvl w:val="1"/>
-          <w:numId w:val="36"/>
-        </w:numPr>
-        <w:spacing w:after="0" w:line="276" w:lineRule="auto"/>
-      </w:pPr>
-      <w:r>
-        <w:t>3 → 4 Turbine (explain)</w:t>
-      </w:r>
-    </w:p>
-    <w:p>
-      <w:pPr>
-        <w:numPr>
-          <w:ilvl w:val="1"/>
-          <w:numId w:val="37"/>
-        </w:numPr>
-        <w:spacing w:after="0" w:line="276" w:lineRule="auto"/>
-      </w:pPr>
-      <w:r>
-        <w:t>4 → 5 Condenser (explain)</w:t>
-      </w:r>
-    </w:p>
-    <w:p>
-      <w:pPr>
-        <w:numPr>
-          <w:ilvl w:val="1"/>
-          <w:numId w:val="38"/>
-        </w:numPr>
-        <w:spacing w:after="0" w:line="276" w:lineRule="auto"/>
-      </w:pPr>
-      <w:r>
-        <w:t>Steam is superheated in the boiler, but not supercritical, since this is often the variation of the Rankine cycle first taught in thermodynamics courses</w:t>
-      </w:r>
-    </w:p>
-    <w:p>
-      <w:pPr>
-        <w:numPr>
-          <w:ilvl w:val="1"/>
-          <w:numId w:val="39"/>
-        </w:numPr>
-        <w:spacing w:after="0" w:line="276" w:lineRule="auto"/>
-      </w:pPr>
-      <w:r>
-        <w:t xml:space="preserve">Note that supercritical Rankine cycles exist, and nuclear power </w:t>
-      </w:r>
-      <w:proofErr w:type="gramStart"/>
-      <w:r>
-        <w:t>actually do</w:t>
-      </w:r>
-      <w:proofErr w:type="gramEnd"/>
-      <w:r>
-        <w:t xml:space="preserve"> not superheat their steam at all (will get to that later)</w:t>
-      </w:r>
-    </w:p>
-    <w:p>
-      <w:pPr>
-        <w:numPr>
-          <w:ilvl w:val="1"/>
-          <w:numId w:val="40"/>
-        </w:numPr>
-        <w:spacing w:after="0" w:line="276" w:lineRule="auto"/>
-      </w:pPr>
-      <w:r>
-        <w:t>Talk about the importance of maintaining steam quality</w:t>
-      </w:r>
-    </w:p>
-    <w:p>
-      <w:pPr>
-        <w:numPr>
-          <w:ilvl w:val="1"/>
-          <w:numId w:val="41"/>
-        </w:numPr>
-        <w:spacing w:after="0" w:line="276" w:lineRule="auto"/>
+          <w:numId w:val="54"/>
+        </w:numPr>
+        <w:spacing w:after="0"/>
+      </w:pPr>
+      <w:r>
+        <w:t>Link to Basic Rankine Cycle page</w:t>
+      </w:r>
+    </w:p>
+    <w:p>
+      <w:pPr>
+        <w:spacing w:after="0"/>
         <w:rPr>
           <w:b/>
           <w:bCs/>
+          <w:color w:val="A02B93" w:themeColor="accent5"/>
         </w:rPr>
       </w:pPr>
       <w:r>
         <w:rPr>
           <w:b/>
           <w:bCs/>
-        </w:rPr>
+          <w:color w:val="A02B93" w:themeColor="accent5"/>
+        </w:rPr>
+        <w:t>Basic Rankine Cycle</w:t>
+      </w:r>
+    </w:p>
+    <w:p>
+      <w:pPr>
+        <w:spacing w:after="0"/>
+      </w:pPr>
+      <w:r>
+        <w:t>Overview of Basic Rankine Cycle</w:t>
+      </w:r>
+    </w:p>
+    <w:p>
+      <w:pPr>
+        <w:numPr>
+          <w:ilvl w:val="0"/>
+          <w:numId w:val="55"/>
+        </w:numPr>
+        <w:spacing w:after="0"/>
+      </w:pPr>
+      <w:r>
+        <w:t>Intended for thermodynamics I students (ME 235 at the University of Michigan)</w:t>
+      </w:r>
+    </w:p>
+    <w:p>
+      <w:pPr>
+        <w:numPr>
+          <w:ilvl w:val="0"/>
+          <w:numId w:val="55"/>
+        </w:numPr>
+        <w:spacing w:after="0"/>
+      </w:pPr>
+      <w:r>
+        <w:t>1 → 2 Pump (explain)</w:t>
+      </w:r>
+    </w:p>
+    <w:p>
+      <w:pPr>
+        <w:numPr>
+          <w:ilvl w:val="0"/>
+          <w:numId w:val="55"/>
+        </w:numPr>
+        <w:spacing w:after="0"/>
+      </w:pPr>
+      <w:r>
+        <w:t>2 → 3 Boiler (explain)</w:t>
+      </w:r>
+    </w:p>
+    <w:p>
+      <w:pPr>
+        <w:numPr>
+          <w:ilvl w:val="0"/>
+          <w:numId w:val="55"/>
+        </w:numPr>
+        <w:spacing w:after="0"/>
+      </w:pPr>
+      <w:r>
+        <w:t>3 → 4 Turbine (explain)</w:t>
+      </w:r>
+    </w:p>
+    <w:p>
+      <w:pPr>
+        <w:numPr>
+          <w:ilvl w:val="0"/>
+          <w:numId w:val="55"/>
+        </w:numPr>
+        <w:spacing w:after="0"/>
+      </w:pPr>
+      <w:r>
+        <w:t>4 → 5 Condenser (explain)</w:t>
+      </w:r>
+    </w:p>
+    <w:p>
+      <w:pPr>
+        <w:numPr>
+          <w:ilvl w:val="0"/>
+          <w:numId w:val="55"/>
+        </w:numPr>
+        <w:spacing w:after="0"/>
+      </w:pPr>
+      <w:r>
+        <w:t>Steam is superheated in the boiler, but not supercritical, since this is often the variation of the Rankine cycle first taught in thermodynamics courses</w:t>
+      </w:r>
+    </w:p>
+    <w:p>
+      <w:pPr>
+        <w:numPr>
+          <w:ilvl w:val="0"/>
+          <w:numId w:val="55"/>
+        </w:numPr>
+        <w:spacing w:after="0"/>
+      </w:pPr>
+      <w:r>
+        <w:t>Note that supercritical Rankine cycles exist, and nuclear power actually do not superheat their steam at all (will get to that later)</w:t>
+      </w:r>
+    </w:p>
+    <w:p>
+      <w:pPr>
+        <w:numPr>
+          <w:ilvl w:val="0"/>
+          <w:numId w:val="55"/>
+        </w:numPr>
+        <w:spacing w:after="0"/>
+      </w:pPr>
+      <w:r>
+        <w:t>Talk about the importance of maintaining steam quality</w:t>
+      </w:r>
+    </w:p>
+    <w:p>
+      <w:pPr>
+        <w:numPr>
+          <w:ilvl w:val="0"/>
+          <w:numId w:val="55"/>
+        </w:numPr>
+        <w:spacing w:after="0"/>
+      </w:pPr>
+      <w:r>
         <w:t>Adjustable slider T-s diagram</w:t>
       </w:r>
     </w:p>
@@ -559,9 +962,55 @@
       <w:pPr>
         <w:numPr>
           <w:ilvl w:val="0"/>
-          <w:numId w:val="1"/>
-        </w:numPr>
-        <w:spacing w:after="0" w:line="276" w:lineRule="auto"/>
+          <w:numId w:val="55"/>
+        </w:numPr>
+        <w:spacing w:after="0"/>
+      </w:pPr>
+      <w:r>
+        <w:lastRenderedPageBreak/>
+        <w:t>User can adjust pump power, heat in, and change the month of the year (use average air temp in Oswego NY and average water temp of Lake Ontario at this location). These should all affect max pressure, max temperature, main steam flow rate, condenser pressure, and more. Include re</w:t>
+      </w:r>
+      <w:r>
+        <w:t>a</w:t>
+      </w:r>
+      <w:r>
+        <w:t>douts for all these metrics, as if you are operating the plant</w:t>
+      </w:r>
+      <w:r>
+        <w:t>. Include readouts of both thermal efficiency and second law efficiency. Dead state temperature will be outside air temp. Water temp should mainly effect condenser pressure.</w:t>
+      </w:r>
+    </w:p>
+    <w:p>
+      <w:pPr>
+        <w:numPr>
+          <w:ilvl w:val="0"/>
+          <w:numId w:val="55"/>
+        </w:numPr>
+        <w:spacing w:after="0"/>
+      </w:pPr>
+      <w:r>
+        <w:t>Use the tables in the steam tables in docs folder for the data</w:t>
+      </w:r>
+    </w:p>
+    <w:p>
+      <w:pPr>
+        <w:numPr>
+          <w:ilvl w:val="1"/>
+          <w:numId w:val="56"/>
+        </w:numPr>
+        <w:spacing w:after="0"/>
+      </w:pPr>
+      <w:r>
+        <w:t>Is this enough data/does it contain supercritical properties? If not, find another reliable data source</w:t>
+      </w:r>
+    </w:p>
+    <w:p>
+      <w:pPr>
+        <w:numPr>
+          <w:ilvl w:val="0"/>
+          <w:numId w:val="57"/>
+        </w:numPr>
+        <w:spacing w:after="0"/>
       </w:pPr>
       <w:r>
         <w:t>Basic Rankine Cycle, where steam is not superheated</w:t>
@@ -571,9 +1020,9 @@
       <w:pPr>
         <w:numPr>
           <w:ilvl w:val="1"/>
-          <w:numId w:val="42"/>
-        </w:numPr>
-        <w:spacing w:after="0" w:line="276" w:lineRule="auto"/>
+          <w:numId w:val="58"/>
+        </w:numPr>
+        <w:spacing w:after="0"/>
       </w:pPr>
       <w:r>
         <w:t>Steam is not superheated in nuclear power plants, explain why</w:t>
@@ -583,204 +1032,182 @@
       <w:pPr>
         <w:numPr>
           <w:ilvl w:val="1"/>
-          <w:numId w:val="43"/>
-        </w:numPr>
-        <w:spacing w:after="0" w:line="276" w:lineRule="auto"/>
+          <w:numId w:val="59"/>
+        </w:numPr>
+        <w:spacing w:after="0"/>
+      </w:pPr>
+      <w:r>
+        <w:t>Adjustable slider T-s diagram</w:t>
+      </w:r>
+    </w:p>
+    <w:p>
+      <w:pPr>
+        <w:numPr>
+          <w:ilvl w:val="1"/>
+          <w:numId w:val="60"/>
+        </w:numPr>
+        <w:spacing w:after="0"/>
+      </w:pPr>
+      <w:r>
+        <w:t>Uh oh. We have an issue. The steam leaving the turbine is of poor quality</w:t>
+      </w:r>
+    </w:p>
+    <w:p>
+      <w:pPr>
+        <w:numPr>
+          <w:ilvl w:val="1"/>
+          <w:numId w:val="61"/>
+        </w:numPr>
+        <w:spacing w:after="0"/>
+      </w:pPr>
+      <w:r>
+        <w:t>Steam cannot be too wet in the turbine. Explain why.</w:t>
+      </w:r>
+    </w:p>
+    <w:p>
+      <w:pPr>
+        <w:numPr>
+          <w:ilvl w:val="1"/>
+          <w:numId w:val="62"/>
+        </w:numPr>
+        <w:spacing w:after="0"/>
+      </w:pPr>
+      <w:r>
+        <w:t>Internal link to Reactor and Turbine materials tab</w:t>
+      </w:r>
+    </w:p>
+    <w:p>
+      <w:pPr>
+        <w:numPr>
+          <w:ilvl w:val="1"/>
+          <w:numId w:val="63"/>
+        </w:numPr>
+        <w:spacing w:after="0"/>
+      </w:pPr>
+      <w:r>
+        <w:t>Basic Rankine Cycle literally does not work</w:t>
+      </w:r>
+    </w:p>
+    <w:p>
+      <w:pPr>
+        <w:numPr>
+          <w:ilvl w:val="1"/>
+          <w:numId w:val="64"/>
+        </w:numPr>
+        <w:spacing w:after="0"/>
+      </w:pPr>
+      <w:r>
+        <w:t>Solution: two turbine stages, high and low pressure, reheat steam between stages</w:t>
+      </w:r>
+    </w:p>
+    <w:p>
+      <w:pPr>
+        <w:numPr>
+          <w:ilvl w:val="2"/>
+          <w:numId w:val="65"/>
+        </w:numPr>
+        <w:spacing w:after="0"/>
+      </w:pPr>
+      <w:r>
+        <w:t>This is actually pretty standard for all power plants since it increases efficiency, but it is basically required for steam quality in nuclear plants</w:t>
+      </w:r>
+    </w:p>
+    <w:p>
+      <w:pPr>
+        <w:numPr>
+          <w:ilvl w:val="2"/>
+          <w:numId w:val="66"/>
+        </w:numPr>
+        <w:spacing w:after="0"/>
+      </w:pPr>
+      <w:r>
+        <w:t>Internal link to Nuclear Reheat Rankine Cycle tab</w:t>
+      </w:r>
+    </w:p>
+    <w:p>
+      <w:pPr>
+        <w:spacing w:after="0"/>
         <w:rPr>
           <w:b/>
           <w:bCs/>
         </w:rPr>
       </w:pPr>
-      <w:r>
+    </w:p>
+    <w:p>
+      <w:pPr>
+        <w:spacing w:after="0"/>
         <w:rPr>
           <w:b/>
           <w:bCs/>
-        </w:rPr>
-        <w:t>Adjustable slider T-s diagram</w:t>
-      </w:r>
-    </w:p>
-    <w:p>
-      <w:pPr>
-        <w:numPr>
-          <w:ilvl w:val="1"/>
-          <w:numId w:val="44"/>
-        </w:numPr>
-        <w:spacing w:after="0" w:line="276" w:lineRule="auto"/>
-      </w:pPr>
-      <w:r>
-        <w:t>Uh oh. We have an issue. The steam leaving the turbine is of poor quality</w:t>
-      </w:r>
-    </w:p>
-    <w:p>
-      <w:pPr>
-        <w:numPr>
-          <w:ilvl w:val="1"/>
-          <w:numId w:val="45"/>
-        </w:numPr>
-        <w:spacing w:after="0" w:line="276" w:lineRule="auto"/>
-      </w:pPr>
-      <w:r>
-        <w:t>Steam cannot be too wet in the turbine. Explain why.</w:t>
-      </w:r>
-    </w:p>
-    <w:p>
-      <w:pPr>
-        <w:numPr>
-          <w:ilvl w:val="1"/>
-          <w:numId w:val="46"/>
-        </w:numPr>
-        <w:spacing w:after="0" w:line="276" w:lineRule="auto"/>
-      </w:pPr>
-      <w:r>
-        <w:t>Internal link to Reactor and Turbine materials tab</w:t>
-      </w:r>
-    </w:p>
-    <w:p>
-      <w:pPr>
-        <w:numPr>
-          <w:ilvl w:val="1"/>
-          <w:numId w:val="47"/>
-        </w:numPr>
-        <w:spacing w:after="0" w:line="276" w:lineRule="auto"/>
-      </w:pPr>
-      <w:r>
-        <w:t>Basic Rankine Cycle literally does not work</w:t>
-      </w:r>
-    </w:p>
-    <w:p>
-      <w:pPr>
-        <w:numPr>
-          <w:ilvl w:val="1"/>
-          <w:numId w:val="48"/>
-        </w:numPr>
-        <w:spacing w:after="0" w:line="276" w:lineRule="auto"/>
-      </w:pPr>
-      <w:r>
-        <w:t>Solution: two turbine stages, high and low pressure, reheat steam between stages</w:t>
-      </w:r>
-    </w:p>
-    <w:p>
-      <w:pPr>
-        <w:numPr>
-          <w:ilvl w:val="2"/>
-          <w:numId w:val="49"/>
-        </w:numPr>
-        <w:spacing w:after="0" w:line="276" w:lineRule="auto"/>
-      </w:pPr>
-      <w:r>
-        <w:t xml:space="preserve">This is </w:t>
-      </w:r>
-      <w:proofErr w:type="gramStart"/>
-      <w:r>
-        <w:t>actually pretty</w:t>
-      </w:r>
-      <w:proofErr w:type="gramEnd"/>
-      <w:r>
-        <w:t xml:space="preserve"> standard for all power plants since it increases efficiency, but it is basically required for steam quality in nuclear plants</w:t>
-      </w:r>
-    </w:p>
-    <w:p>
-      <w:pPr>
-        <w:numPr>
-          <w:ilvl w:val="2"/>
-          <w:numId w:val="50"/>
-        </w:numPr>
-        <w:spacing w:after="0" w:line="276" w:lineRule="auto"/>
-      </w:pPr>
-      <w:r>
-        <w:t>Internal link to Nuclear Reheat Rankine Cycle tab</w:t>
-      </w:r>
-    </w:p>
-    <w:p>
-      <w:pPr>
-        <w:spacing w:after="0" w:line="276" w:lineRule="auto"/>
-      </w:pPr>
-    </w:p>
-    <w:p>
-      <w:pPr>
-        <w:spacing w:after="0" w:line="276" w:lineRule="auto"/>
+          <w:color w:val="A02B93" w:themeColor="accent5"/>
+        </w:rPr>
       </w:pPr>
       <w:r>
         <w:rPr>
           <w:b/>
           <w:bCs/>
-        </w:rPr>
-        <w:t>Tab 2 - Nuclear Reheat Rankine Cycle</w:t>
-      </w:r>
-    </w:p>
-    <w:p>
-      <w:pPr>
-        <w:spacing w:after="0" w:line="276" w:lineRule="auto"/>
-      </w:pPr>
-    </w:p>
-    <w:p>
-      <w:pPr>
-        <w:spacing w:after="0" w:line="276" w:lineRule="auto"/>
-      </w:pPr>
-      <w:r>
+          <w:color w:val="A02B93" w:themeColor="accent5"/>
+        </w:rPr>
+        <w:t>Nuclear Reheat Rankine Cycle</w:t>
+      </w:r>
+    </w:p>
+    <w:p>
+      <w:pPr>
+        <w:spacing w:after="0"/>
         <w:rPr>
           <w:b/>
           <w:bCs/>
-        </w:rPr>
-        <w:t>Tab 3 - Nuclear Regenerative Reheat Rankine Cycle</w:t>
-      </w:r>
-    </w:p>
-    <w:p>
-      <w:pPr>
-        <w:spacing w:after="0" w:line="276" w:lineRule="auto"/>
-      </w:pPr>
-    </w:p>
-    <w:p>
-      <w:pPr>
-        <w:spacing w:after="0" w:line="276" w:lineRule="auto"/>
-      </w:pPr>
-      <w:r>
+          <w:color w:val="A02B93" w:themeColor="accent5"/>
+        </w:rPr>
+      </w:pPr>
+    </w:p>
+    <w:p>
+      <w:pPr>
+        <w:spacing w:after="0"/>
         <w:rPr>
           <w:b/>
           <w:bCs/>
-        </w:rPr>
-        <w:t>Tab 4 - Real Nuclear Rankine Cycle</w:t>
-      </w:r>
-    </w:p>
-    <w:p>
-      <w:pPr>
-        <w:spacing w:after="0" w:line="276" w:lineRule="auto"/>
-      </w:pPr>
-    </w:p>
-    <w:p>
-      <w:pPr>
-        <w:spacing w:after="0" w:line="276" w:lineRule="auto"/>
+          <w:color w:val="A02B93" w:themeColor="accent5"/>
+        </w:rPr>
       </w:pPr>
       <w:r>
         <w:rPr>
           <w:b/>
           <w:bCs/>
-        </w:rPr>
-        <w:t>Tab 5 - Exergy and Second Law Efficiency</w:t>
-      </w:r>
-    </w:p>
-    <w:p>
-      <w:pPr>
-        <w:spacing w:after="0" w:line="276" w:lineRule="auto"/>
-      </w:pPr>
-    </w:p>
-    <w:p>
-      <w:pPr>
-        <w:spacing w:after="0" w:line="276" w:lineRule="auto"/>
-      </w:pPr>
-      <w:r>
+          <w:color w:val="A02B93" w:themeColor="accent5"/>
+        </w:rPr>
+        <w:t>Nuclear Reheat Regenerative Rankine Cycle</w:t>
+      </w:r>
+    </w:p>
+    <w:p>
+      <w:pPr>
+        <w:spacing w:after="0"/>
         <w:rPr>
           <w:b/>
           <w:bCs/>
-        </w:rPr>
-        <w:t>Tab 6 - Reactor and Turbine Materials</w:t>
-      </w:r>
-    </w:p>
-    <w:p>
-      <w:pPr>
-        <w:spacing w:after="0" w:line="276" w:lineRule="auto"/>
-      </w:pPr>
-    </w:p>
+          <w:color w:val="A02B93" w:themeColor="accent5"/>
+        </w:rPr>
+      </w:pPr>
+    </w:p>
+    <w:p>
+      <w:pPr>
+        <w:spacing w:after="0"/>
+        <w:rPr>
+          <w:b/>
+          <w:bCs/>
+          <w:color w:val="A02B93" w:themeColor="accent5"/>
+        </w:rPr>
+      </w:pPr>
+      <w:r>
+        <w:rPr>
+          <w:b/>
+          <w:bCs/>
+          <w:color w:val="A02B93" w:themeColor="accent5"/>
+        </w:rPr>
+        <w:t>Reactor and Turbine Materials</w:t>
+      </w:r>
+    </w:p>
+    <w:p/>
     <w:sectPr>
       <w:pgSz w:w="12240" w:h="15840"/>
       <w:pgMar w:top="1440" w:right="1440" w:bottom="1440" w:left="1440" w:header="720" w:footer="720" w:gutter="0"/>
@@ -794,9 +1221,9 @@
 <file path=word/numbering.xml><?xml version="1.0" encoding="utf-8"?>
 <w:numbering xmlns:wpc="http://schemas.microsoft.com/office/word/2010/wordprocessingCanvas" xmlns:cx="http://schemas.microsoft.com/office/drawing/2014/chartex" xmlns:cx1="http://schemas.microsoft.com/office/drawing/2015/9/8/chartex" xmlns:cx2="http://schemas.microsoft.com/office/drawing/2015/10/21/chartex" xmlns:cx3="http://schemas.microsoft.com/office/drawing/2016/5/9/chartex" xmlns:cx4="http://schemas.microsoft.com/office/drawing/2016/5/10/chartex" xmlns:cx5="http://schemas.microsoft.com/office/drawing/2016/5/11/chartex" xmlns:cx6="http://schemas.microsoft.com/office/drawing/2016/5/12/chartex" xmlns:cx7="http://schemas.microsoft.com/office/drawing/2016/5/13/chartex" xmlns:cx8="http://schemas.microsoft.com/office/drawing/2016/5/14/chartex" xmlns:mc="http://schemas.openxmlformats.org/markup-compatibility/2006" xmlns:aink="http://schemas.microsoft.com/office/drawing/2016/ink" xmlns:am3d="http://schemas.microsoft.com/office/drawing/2017/model3d" xmlns:o="urn:schemas-microsoft-com:office:office" xmlns:oel="http://schemas.microsoft.com/office/2019/extlst" xmlns:r="http://schemas.openxmlformats.org/officeDocument/2006/relationships" xmlns:m="http://schemas.openxmlformats.org/officeDocument/2006/math" xmlns:v="urn:schemas-microsoft-com:vml" xmlns:wp14="http://schemas.microsoft.com/office/word/2010/wordprocessingDrawing" xmlns:wp="http://schemas.openxmlformats.org/drawingml/2006/wordprocessingDrawing" xmlns:w10="urn:schemas-microsoft-com:office:word" xmlns:w="http://schemas.openxmlformats.org/wordprocessingml/2006/main" xmlns:w14="http://schemas.microsoft.com/office/word/2010/wordml" xmlns:w15="http://schemas.microsoft.com/office/word/2012/wordml" xmlns:w16cex="http://schemas.microsoft.com/office/word/2018/wordml/cex" xmlns:w16cid="http://schemas.microsoft.com/office/word/2016/wordml/cid" xmlns:w16="http://schemas.microsoft.com/office/word/2018/wordml" xmlns:w16du="http://schemas.microsoft.com/office/word/2023/wordml/word16du" xmlns:w16sdtdh="http://schemas.microsoft.com/office/word/2020/wordml/sdtdatahash" xmlns:w16sdtfl="http://schemas.microsoft.com/office/word/2024/wordml/sdtformatlock" xmlns:w16se="http://schemas.microsoft.com/office/word/2015/wordml/symex" xmlns:wpg="http://schemas.microsoft.com/office/word/2010/wordprocessingGroup" xmlns:wpi="http://schemas.microsoft.com/office/word/2010/wordprocessingInk" xmlns:wne="http://schemas.microsoft.com/office/word/2006/wordml" xmlns:wps="http://schemas.microsoft.com/office/word/2010/wordprocessingShape" mc:Ignorable="w14 w15 w16se w16cid w16 w16cex w16sdtdh w16sdtfl w16du wp14">
   <w:abstractNum w:abstractNumId="0" w15:restartNumberingAfterBreak="0">
-    <w:nsid w:val="39134FF3"/>
+    <w:nsid w:val="0B3E04BB"/>
     <w:multiLevelType w:val="multilevel"/>
-    <w:tmpl w:val="E63E59EA"/>
+    <w:tmpl w:val="650A97E0"/>
     <w:lvl w:ilvl="0">
       <w:start w:val="1"/>
       <w:numFmt w:val="bullet"/>
@@ -813,6 +1240,155 @@
         <w:sz w:val="20"/>
       </w:rPr>
     </w:lvl>
+    <w:lvl w:ilvl="1" w:tentative="1">
+      <w:start w:val="1"/>
+      <w:numFmt w:val="bullet"/>
+      <w:lvlText w:val="o"/>
+      <w:lvlJc w:val="left"/>
+      <w:pPr>
+        <w:tabs>
+          <w:tab w:val="num" w:pos="1440"/>
+        </w:tabs>
+        <w:ind w:left="1440" w:hanging="360"/>
+      </w:pPr>
+      <w:rPr>
+        <w:rFonts w:ascii="Courier New" w:hAnsi="Courier New" w:hint="default"/>
+        <w:sz w:val="20"/>
+      </w:rPr>
+    </w:lvl>
+    <w:lvl w:ilvl="2" w:tentative="1">
+      <w:start w:val="1"/>
+      <w:numFmt w:val="bullet"/>
+      <w:lvlText w:val=""/>
+      <w:lvlJc w:val="left"/>
+      <w:pPr>
+        <w:tabs>
+          <w:tab w:val="num" w:pos="2160"/>
+        </w:tabs>
+        <w:ind w:left="2160" w:hanging="360"/>
+      </w:pPr>
+      <w:rPr>
+        <w:rFonts w:ascii="Wingdings" w:hAnsi="Wingdings" w:hint="default"/>
+        <w:sz w:val="20"/>
+      </w:rPr>
+    </w:lvl>
+    <w:lvl w:ilvl="3" w:tentative="1">
+      <w:start w:val="1"/>
+      <w:numFmt w:val="bullet"/>
+      <w:lvlText w:val=""/>
+      <w:lvlJc w:val="left"/>
+      <w:pPr>
+        <w:tabs>
+          <w:tab w:val="num" w:pos="2880"/>
+        </w:tabs>
+        <w:ind w:left="2880" w:hanging="360"/>
+      </w:pPr>
+      <w:rPr>
+        <w:rFonts w:ascii="Wingdings" w:hAnsi="Wingdings" w:hint="default"/>
+        <w:sz w:val="20"/>
+      </w:rPr>
+    </w:lvl>
+    <w:lvl w:ilvl="4" w:tentative="1">
+      <w:start w:val="1"/>
+      <w:numFmt w:val="bullet"/>
+      <w:lvlText w:val=""/>
+      <w:lvlJc w:val="left"/>
+      <w:pPr>
+        <w:tabs>
+          <w:tab w:val="num" w:pos="3600"/>
+        </w:tabs>
+        <w:ind w:left="3600" w:hanging="360"/>
+      </w:pPr>
+      <w:rPr>
+        <w:rFonts w:ascii="Wingdings" w:hAnsi="Wingdings" w:hint="default"/>
+        <w:sz w:val="20"/>
+      </w:rPr>
+    </w:lvl>
+    <w:lvl w:ilvl="5" w:tentative="1">
+      <w:start w:val="1"/>
+      <w:numFmt w:val="bullet"/>
+      <w:lvlText w:val=""/>
+      <w:lvlJc w:val="left"/>
+      <w:pPr>
+        <w:tabs>
+          <w:tab w:val="num" w:pos="4320"/>
+        </w:tabs>
+        <w:ind w:left="4320" w:hanging="360"/>
+      </w:pPr>
+      <w:rPr>
+        <w:rFonts w:ascii="Wingdings" w:hAnsi="Wingdings" w:hint="default"/>
+        <w:sz w:val="20"/>
+      </w:rPr>
+    </w:lvl>
+    <w:lvl w:ilvl="6" w:tentative="1">
+      <w:start w:val="1"/>
+      <w:numFmt w:val="bullet"/>
+      <w:lvlText w:val=""/>
+      <w:lvlJc w:val="left"/>
+      <w:pPr>
+        <w:tabs>
+          <w:tab w:val="num" w:pos="5040"/>
+        </w:tabs>
+        <w:ind w:left="5040" w:hanging="360"/>
+      </w:pPr>
+      <w:rPr>
+        <w:rFonts w:ascii="Wingdings" w:hAnsi="Wingdings" w:hint="default"/>
+        <w:sz w:val="20"/>
+      </w:rPr>
+    </w:lvl>
+    <w:lvl w:ilvl="7" w:tentative="1">
+      <w:start w:val="1"/>
+      <w:numFmt w:val="bullet"/>
+      <w:lvlText w:val=""/>
+      <w:lvlJc w:val="left"/>
+      <w:pPr>
+        <w:tabs>
+          <w:tab w:val="num" w:pos="5760"/>
+        </w:tabs>
+        <w:ind w:left="5760" w:hanging="360"/>
+      </w:pPr>
+      <w:rPr>
+        <w:rFonts w:ascii="Wingdings" w:hAnsi="Wingdings" w:hint="default"/>
+        <w:sz w:val="20"/>
+      </w:rPr>
+    </w:lvl>
+    <w:lvl w:ilvl="8" w:tentative="1">
+      <w:start w:val="1"/>
+      <w:numFmt w:val="bullet"/>
+      <w:lvlText w:val=""/>
+      <w:lvlJc w:val="left"/>
+      <w:pPr>
+        <w:tabs>
+          <w:tab w:val="num" w:pos="6480"/>
+        </w:tabs>
+        <w:ind w:left="6480" w:hanging="360"/>
+      </w:pPr>
+      <w:rPr>
+        <w:rFonts w:ascii="Wingdings" w:hAnsi="Wingdings" w:hint="default"/>
+        <w:sz w:val="20"/>
+      </w:rPr>
+    </w:lvl>
+  </w:abstractNum>
+  <w:abstractNum w:abstractNumId="1" w15:restartNumberingAfterBreak="0">
+    <w:nsid w:val="10EC6C63"/>
+    <w:multiLevelType w:val="multilevel"/>
+    <w:tmpl w:val="A730619E"/>
+    <w:lvl w:ilvl="0">
+      <w:start w:val="1"/>
+      <w:numFmt w:val="bullet"/>
+      <w:lvlText w:val=""/>
+      <w:lvlJc w:val="left"/>
+      <w:pPr>
+        <w:tabs>
+          <w:tab w:val="num" w:pos="720"/>
+        </w:tabs>
+        <w:ind w:left="720" w:hanging="360"/>
+      </w:pPr>
+      <w:rPr>
+        <w:rFonts w:ascii="Symbol" w:hAnsi="Symbol" w:hint="default"/>
+        <w:sz w:val="20"/>
+      </w:rPr>
+    </w:lvl>
     <w:lvl w:ilvl="1">
       <w:start w:val="1"/>
       <w:numFmt w:val="bullet"/>
@@ -845,6 +1421,155 @@
         <w:sz w:val="20"/>
       </w:rPr>
     </w:lvl>
+    <w:lvl w:ilvl="3" w:tentative="1">
+      <w:start w:val="1"/>
+      <w:numFmt w:val="bullet"/>
+      <w:lvlText w:val=""/>
+      <w:lvlJc w:val="left"/>
+      <w:pPr>
+        <w:tabs>
+          <w:tab w:val="num" w:pos="2880"/>
+        </w:tabs>
+        <w:ind w:left="2880" w:hanging="360"/>
+      </w:pPr>
+      <w:rPr>
+        <w:rFonts w:ascii="Wingdings" w:hAnsi="Wingdings" w:hint="default"/>
+        <w:sz w:val="20"/>
+      </w:rPr>
+    </w:lvl>
+    <w:lvl w:ilvl="4" w:tentative="1">
+      <w:start w:val="1"/>
+      <w:numFmt w:val="bullet"/>
+      <w:lvlText w:val=""/>
+      <w:lvlJc w:val="left"/>
+      <w:pPr>
+        <w:tabs>
+          <w:tab w:val="num" w:pos="3600"/>
+        </w:tabs>
+        <w:ind w:left="3600" w:hanging="360"/>
+      </w:pPr>
+      <w:rPr>
+        <w:rFonts w:ascii="Wingdings" w:hAnsi="Wingdings" w:hint="default"/>
+        <w:sz w:val="20"/>
+      </w:rPr>
+    </w:lvl>
+    <w:lvl w:ilvl="5" w:tentative="1">
+      <w:start w:val="1"/>
+      <w:numFmt w:val="bullet"/>
+      <w:lvlText w:val=""/>
+      <w:lvlJc w:val="left"/>
+      <w:pPr>
+        <w:tabs>
+          <w:tab w:val="num" w:pos="4320"/>
+        </w:tabs>
+        <w:ind w:left="4320" w:hanging="360"/>
+      </w:pPr>
+      <w:rPr>
+        <w:rFonts w:ascii="Wingdings" w:hAnsi="Wingdings" w:hint="default"/>
+        <w:sz w:val="20"/>
+      </w:rPr>
+    </w:lvl>
+    <w:lvl w:ilvl="6" w:tentative="1">
+      <w:start w:val="1"/>
+      <w:numFmt w:val="bullet"/>
+      <w:lvlText w:val=""/>
+      <w:lvlJc w:val="left"/>
+      <w:pPr>
+        <w:tabs>
+          <w:tab w:val="num" w:pos="5040"/>
+        </w:tabs>
+        <w:ind w:left="5040" w:hanging="360"/>
+      </w:pPr>
+      <w:rPr>
+        <w:rFonts w:ascii="Wingdings" w:hAnsi="Wingdings" w:hint="default"/>
+        <w:sz w:val="20"/>
+      </w:rPr>
+    </w:lvl>
+    <w:lvl w:ilvl="7" w:tentative="1">
+      <w:start w:val="1"/>
+      <w:numFmt w:val="bullet"/>
+      <w:lvlText w:val=""/>
+      <w:lvlJc w:val="left"/>
+      <w:pPr>
+        <w:tabs>
+          <w:tab w:val="num" w:pos="5760"/>
+        </w:tabs>
+        <w:ind w:left="5760" w:hanging="360"/>
+      </w:pPr>
+      <w:rPr>
+        <w:rFonts w:ascii="Wingdings" w:hAnsi="Wingdings" w:hint="default"/>
+        <w:sz w:val="20"/>
+      </w:rPr>
+    </w:lvl>
+    <w:lvl w:ilvl="8" w:tentative="1">
+      <w:start w:val="1"/>
+      <w:numFmt w:val="bullet"/>
+      <w:lvlText w:val=""/>
+      <w:lvlJc w:val="left"/>
+      <w:pPr>
+        <w:tabs>
+          <w:tab w:val="num" w:pos="6480"/>
+        </w:tabs>
+        <w:ind w:left="6480" w:hanging="360"/>
+      </w:pPr>
+      <w:rPr>
+        <w:rFonts w:ascii="Wingdings" w:hAnsi="Wingdings" w:hint="default"/>
+        <w:sz w:val="20"/>
+      </w:rPr>
+    </w:lvl>
+  </w:abstractNum>
+  <w:abstractNum w:abstractNumId="2" w15:restartNumberingAfterBreak="0">
+    <w:nsid w:val="2ED43012"/>
+    <w:multiLevelType w:val="multilevel"/>
+    <w:tmpl w:val="C8D40FB0"/>
+    <w:lvl w:ilvl="0">
+      <w:start w:val="1"/>
+      <w:numFmt w:val="bullet"/>
+      <w:lvlText w:val=""/>
+      <w:lvlJc w:val="left"/>
+      <w:pPr>
+        <w:tabs>
+          <w:tab w:val="num" w:pos="720"/>
+        </w:tabs>
+        <w:ind w:left="720" w:hanging="360"/>
+      </w:pPr>
+      <w:rPr>
+        <w:rFonts w:ascii="Symbol" w:hAnsi="Symbol" w:hint="default"/>
+        <w:sz w:val="20"/>
+      </w:rPr>
+    </w:lvl>
+    <w:lvl w:ilvl="1">
+      <w:start w:val="1"/>
+      <w:numFmt w:val="bullet"/>
+      <w:lvlText w:val="o"/>
+      <w:lvlJc w:val="left"/>
+      <w:pPr>
+        <w:tabs>
+          <w:tab w:val="num" w:pos="1440"/>
+        </w:tabs>
+        <w:ind w:left="1440" w:hanging="360"/>
+      </w:pPr>
+      <w:rPr>
+        <w:rFonts w:ascii="Courier New" w:hAnsi="Courier New" w:hint="default"/>
+        <w:sz w:val="20"/>
+      </w:rPr>
+    </w:lvl>
+    <w:lvl w:ilvl="2">
+      <w:start w:val="1"/>
+      <w:numFmt w:val="bullet"/>
+      <w:lvlText w:val=""/>
+      <w:lvlJc w:val="left"/>
+      <w:pPr>
+        <w:tabs>
+          <w:tab w:val="num" w:pos="2160"/>
+        </w:tabs>
+        <w:ind w:left="2160" w:hanging="360"/>
+      </w:pPr>
+      <w:rPr>
+        <w:rFonts w:ascii="Wingdings" w:hAnsi="Wingdings" w:hint="default"/>
+        <w:sz w:val="20"/>
+      </w:rPr>
+    </w:lvl>
     <w:lvl w:ilvl="3">
       <w:start w:val="1"/>
       <w:numFmt w:val="bullet"/>
@@ -942,11 +1667,458 @@
       </w:rPr>
     </w:lvl>
   </w:abstractNum>
-  <w:num w:numId="1" w16cid:durableId="1768769799">
-    <w:abstractNumId w:val="0"/>
-  </w:num>
-  <w:num w:numId="2" w16cid:durableId="1301302383">
-    <w:abstractNumId w:val="0"/>
+  <w:abstractNum w:abstractNumId="3" w15:restartNumberingAfterBreak="0">
+    <w:nsid w:val="63D3578D"/>
+    <w:multiLevelType w:val="multilevel"/>
+    <w:tmpl w:val="2D3492C6"/>
+    <w:lvl w:ilvl="0">
+      <w:start w:val="1"/>
+      <w:numFmt w:val="bullet"/>
+      <w:lvlText w:val=""/>
+      <w:lvlJc w:val="left"/>
+      <w:pPr>
+        <w:tabs>
+          <w:tab w:val="num" w:pos="720"/>
+        </w:tabs>
+        <w:ind w:left="720" w:hanging="360"/>
+      </w:pPr>
+      <w:rPr>
+        <w:rFonts w:ascii="Symbol" w:hAnsi="Symbol" w:hint="default"/>
+        <w:sz w:val="20"/>
+      </w:rPr>
+    </w:lvl>
+    <w:lvl w:ilvl="1">
+      <w:start w:val="1"/>
+      <w:numFmt w:val="bullet"/>
+      <w:lvlText w:val="o"/>
+      <w:lvlJc w:val="left"/>
+      <w:pPr>
+        <w:tabs>
+          <w:tab w:val="num" w:pos="1440"/>
+        </w:tabs>
+        <w:ind w:left="1440" w:hanging="360"/>
+      </w:pPr>
+      <w:rPr>
+        <w:rFonts w:ascii="Courier New" w:hAnsi="Courier New" w:hint="default"/>
+        <w:sz w:val="20"/>
+      </w:rPr>
+    </w:lvl>
+    <w:lvl w:ilvl="2">
+      <w:start w:val="1"/>
+      <w:numFmt w:val="bullet"/>
+      <w:lvlText w:val=""/>
+      <w:lvlJc w:val="left"/>
+      <w:pPr>
+        <w:tabs>
+          <w:tab w:val="num" w:pos="2160"/>
+        </w:tabs>
+        <w:ind w:left="2160" w:hanging="360"/>
+      </w:pPr>
+      <w:rPr>
+        <w:rFonts w:ascii="Wingdings" w:hAnsi="Wingdings" w:hint="default"/>
+        <w:sz w:val="20"/>
+      </w:rPr>
+    </w:lvl>
+    <w:lvl w:ilvl="3">
+      <w:start w:val="1"/>
+      <w:numFmt w:val="bullet"/>
+      <w:lvlText w:val=""/>
+      <w:lvlJc w:val="left"/>
+      <w:pPr>
+        <w:tabs>
+          <w:tab w:val="num" w:pos="2880"/>
+        </w:tabs>
+        <w:ind w:left="2880" w:hanging="360"/>
+      </w:pPr>
+      <w:rPr>
+        <w:rFonts w:ascii="Wingdings" w:hAnsi="Wingdings" w:hint="default"/>
+        <w:sz w:val="20"/>
+      </w:rPr>
+    </w:lvl>
+    <w:lvl w:ilvl="4" w:tentative="1">
+      <w:start w:val="1"/>
+      <w:numFmt w:val="bullet"/>
+      <w:lvlText w:val=""/>
+      <w:lvlJc w:val="left"/>
+      <w:pPr>
+        <w:tabs>
+          <w:tab w:val="num" w:pos="3600"/>
+        </w:tabs>
+        <w:ind w:left="3600" w:hanging="360"/>
+      </w:pPr>
+      <w:rPr>
+        <w:rFonts w:ascii="Wingdings" w:hAnsi="Wingdings" w:hint="default"/>
+        <w:sz w:val="20"/>
+      </w:rPr>
+    </w:lvl>
+    <w:lvl w:ilvl="5" w:tentative="1">
+      <w:start w:val="1"/>
+      <w:numFmt w:val="bullet"/>
+      <w:lvlText w:val=""/>
+      <w:lvlJc w:val="left"/>
+      <w:pPr>
+        <w:tabs>
+          <w:tab w:val="num" w:pos="4320"/>
+        </w:tabs>
+        <w:ind w:left="4320" w:hanging="360"/>
+      </w:pPr>
+      <w:rPr>
+        <w:rFonts w:ascii="Wingdings" w:hAnsi="Wingdings" w:hint="default"/>
+        <w:sz w:val="20"/>
+      </w:rPr>
+    </w:lvl>
+    <w:lvl w:ilvl="6" w:tentative="1">
+      <w:start w:val="1"/>
+      <w:numFmt w:val="bullet"/>
+      <w:lvlText w:val=""/>
+      <w:lvlJc w:val="left"/>
+      <w:pPr>
+        <w:tabs>
+          <w:tab w:val="num" w:pos="5040"/>
+        </w:tabs>
+        <w:ind w:left="5040" w:hanging="360"/>
+      </w:pPr>
+      <w:rPr>
+        <w:rFonts w:ascii="Wingdings" w:hAnsi="Wingdings" w:hint="default"/>
+        <w:sz w:val="20"/>
+      </w:rPr>
+    </w:lvl>
+    <w:lvl w:ilvl="7" w:tentative="1">
+      <w:start w:val="1"/>
+      <w:numFmt w:val="bullet"/>
+      <w:lvlText w:val=""/>
+      <w:lvlJc w:val="left"/>
+      <w:pPr>
+        <w:tabs>
+          <w:tab w:val="num" w:pos="5760"/>
+        </w:tabs>
+        <w:ind w:left="5760" w:hanging="360"/>
+      </w:pPr>
+      <w:rPr>
+        <w:rFonts w:ascii="Wingdings" w:hAnsi="Wingdings" w:hint="default"/>
+        <w:sz w:val="20"/>
+      </w:rPr>
+    </w:lvl>
+    <w:lvl w:ilvl="8" w:tentative="1">
+      <w:start w:val="1"/>
+      <w:numFmt w:val="bullet"/>
+      <w:lvlText w:val=""/>
+      <w:lvlJc w:val="left"/>
+      <w:pPr>
+        <w:tabs>
+          <w:tab w:val="num" w:pos="6480"/>
+        </w:tabs>
+        <w:ind w:left="6480" w:hanging="360"/>
+      </w:pPr>
+      <w:rPr>
+        <w:rFonts w:ascii="Wingdings" w:hAnsi="Wingdings" w:hint="default"/>
+        <w:sz w:val="20"/>
+      </w:rPr>
+    </w:lvl>
+  </w:abstractNum>
+  <w:abstractNum w:abstractNumId="4" w15:restartNumberingAfterBreak="0">
+    <w:nsid w:val="73E30A8C"/>
+    <w:multiLevelType w:val="multilevel"/>
+    <w:tmpl w:val="AF12F71A"/>
+    <w:lvl w:ilvl="0">
+      <w:start w:val="1"/>
+      <w:numFmt w:val="bullet"/>
+      <w:lvlText w:val=""/>
+      <w:lvlJc w:val="left"/>
+      <w:pPr>
+        <w:tabs>
+          <w:tab w:val="num" w:pos="720"/>
+        </w:tabs>
+        <w:ind w:left="720" w:hanging="360"/>
+      </w:pPr>
+      <w:rPr>
+        <w:rFonts w:ascii="Symbol" w:hAnsi="Symbol" w:hint="default"/>
+        <w:sz w:val="20"/>
+      </w:rPr>
+    </w:lvl>
+    <w:lvl w:ilvl="1">
+      <w:start w:val="1"/>
+      <w:numFmt w:val="bullet"/>
+      <w:lvlText w:val="o"/>
+      <w:lvlJc w:val="left"/>
+      <w:pPr>
+        <w:tabs>
+          <w:tab w:val="num" w:pos="1440"/>
+        </w:tabs>
+        <w:ind w:left="1440" w:hanging="360"/>
+      </w:pPr>
+      <w:rPr>
+        <w:rFonts w:ascii="Courier New" w:hAnsi="Courier New" w:hint="default"/>
+        <w:sz w:val="20"/>
+      </w:rPr>
+    </w:lvl>
+    <w:lvl w:ilvl="2" w:tentative="1">
+      <w:start w:val="1"/>
+      <w:numFmt w:val="bullet"/>
+      <w:lvlText w:val=""/>
+      <w:lvlJc w:val="left"/>
+      <w:pPr>
+        <w:tabs>
+          <w:tab w:val="num" w:pos="2160"/>
+        </w:tabs>
+        <w:ind w:left="2160" w:hanging="360"/>
+      </w:pPr>
+      <w:rPr>
+        <w:rFonts w:ascii="Wingdings" w:hAnsi="Wingdings" w:hint="default"/>
+        <w:sz w:val="20"/>
+      </w:rPr>
+    </w:lvl>
+    <w:lvl w:ilvl="3" w:tentative="1">
+      <w:start w:val="1"/>
+      <w:numFmt w:val="bullet"/>
+      <w:lvlText w:val=""/>
+      <w:lvlJc w:val="left"/>
+      <w:pPr>
+        <w:tabs>
+          <w:tab w:val="num" w:pos="2880"/>
+        </w:tabs>
+        <w:ind w:left="2880" w:hanging="360"/>
+      </w:pPr>
+      <w:rPr>
+        <w:rFonts w:ascii="Wingdings" w:hAnsi="Wingdings" w:hint="default"/>
+        <w:sz w:val="20"/>
+      </w:rPr>
+    </w:lvl>
+    <w:lvl w:ilvl="4" w:tentative="1">
+      <w:start w:val="1"/>
+      <w:numFmt w:val="bullet"/>
+      <w:lvlText w:val=""/>
+      <w:lvlJc w:val="left"/>
+      <w:pPr>
+        <w:tabs>
+          <w:tab w:val="num" w:pos="3600"/>
+        </w:tabs>
+        <w:ind w:left="3600" w:hanging="360"/>
+      </w:pPr>
+      <w:rPr>
+        <w:rFonts w:ascii="Wingdings" w:hAnsi="Wingdings" w:hint="default"/>
+        <w:sz w:val="20"/>
+      </w:rPr>
+    </w:lvl>
+    <w:lvl w:ilvl="5" w:tentative="1">
+      <w:start w:val="1"/>
+      <w:numFmt w:val="bullet"/>
+      <w:lvlText w:val=""/>
+      <w:lvlJc w:val="left"/>
+      <w:pPr>
+        <w:tabs>
+          <w:tab w:val="num" w:pos="4320"/>
+        </w:tabs>
+        <w:ind w:left="4320" w:hanging="360"/>
+      </w:pPr>
+      <w:rPr>
+        <w:rFonts w:ascii="Wingdings" w:hAnsi="Wingdings" w:hint="default"/>
+        <w:sz w:val="20"/>
+      </w:rPr>
+    </w:lvl>
+    <w:lvl w:ilvl="6" w:tentative="1">
+      <w:start w:val="1"/>
+      <w:numFmt w:val="bullet"/>
+      <w:lvlText w:val=""/>
+      <w:lvlJc w:val="left"/>
+      <w:pPr>
+        <w:tabs>
+          <w:tab w:val="num" w:pos="5040"/>
+        </w:tabs>
+        <w:ind w:left="5040" w:hanging="360"/>
+      </w:pPr>
+      <w:rPr>
+        <w:rFonts w:ascii="Wingdings" w:hAnsi="Wingdings" w:hint="default"/>
+        <w:sz w:val="20"/>
+      </w:rPr>
+    </w:lvl>
+    <w:lvl w:ilvl="7" w:tentative="1">
+      <w:start w:val="1"/>
+      <w:numFmt w:val="bullet"/>
+      <w:lvlText w:val=""/>
+      <w:lvlJc w:val="left"/>
+      <w:pPr>
+        <w:tabs>
+          <w:tab w:val="num" w:pos="5760"/>
+        </w:tabs>
+        <w:ind w:left="5760" w:hanging="360"/>
+      </w:pPr>
+      <w:rPr>
+        <w:rFonts w:ascii="Wingdings" w:hAnsi="Wingdings" w:hint="default"/>
+        <w:sz w:val="20"/>
+      </w:rPr>
+    </w:lvl>
+    <w:lvl w:ilvl="8" w:tentative="1">
+      <w:start w:val="1"/>
+      <w:numFmt w:val="bullet"/>
+      <w:lvlText w:val=""/>
+      <w:lvlJc w:val="left"/>
+      <w:pPr>
+        <w:tabs>
+          <w:tab w:val="num" w:pos="6480"/>
+        </w:tabs>
+        <w:ind w:left="6480" w:hanging="360"/>
+      </w:pPr>
+      <w:rPr>
+        <w:rFonts w:ascii="Wingdings" w:hAnsi="Wingdings" w:hint="default"/>
+        <w:sz w:val="20"/>
+      </w:rPr>
+    </w:lvl>
+  </w:abstractNum>
+  <w:abstractNum w:abstractNumId="5" w15:restartNumberingAfterBreak="0">
+    <w:nsid w:val="796740D4"/>
+    <w:multiLevelType w:val="multilevel"/>
+    <w:tmpl w:val="A042717E"/>
+    <w:lvl w:ilvl="0">
+      <w:start w:val="1"/>
+      <w:numFmt w:val="bullet"/>
+      <w:lvlText w:val=""/>
+      <w:lvlJc w:val="left"/>
+      <w:pPr>
+        <w:tabs>
+          <w:tab w:val="num" w:pos="720"/>
+        </w:tabs>
+        <w:ind w:left="720" w:hanging="360"/>
+      </w:pPr>
+      <w:rPr>
+        <w:rFonts w:ascii="Symbol" w:hAnsi="Symbol" w:hint="default"/>
+        <w:sz w:val="20"/>
+      </w:rPr>
+    </w:lvl>
+    <w:lvl w:ilvl="1">
+      <w:start w:val="1"/>
+      <w:numFmt w:val="bullet"/>
+      <w:lvlText w:val="o"/>
+      <w:lvlJc w:val="left"/>
+      <w:pPr>
+        <w:tabs>
+          <w:tab w:val="num" w:pos="1440"/>
+        </w:tabs>
+        <w:ind w:left="1440" w:hanging="360"/>
+      </w:pPr>
+      <w:rPr>
+        <w:rFonts w:ascii="Courier New" w:hAnsi="Courier New" w:hint="default"/>
+        <w:sz w:val="20"/>
+      </w:rPr>
+    </w:lvl>
+    <w:lvl w:ilvl="2" w:tentative="1">
+      <w:start w:val="1"/>
+      <w:numFmt w:val="bullet"/>
+      <w:lvlText w:val=""/>
+      <w:lvlJc w:val="left"/>
+      <w:pPr>
+        <w:tabs>
+          <w:tab w:val="num" w:pos="2160"/>
+        </w:tabs>
+        <w:ind w:left="2160" w:hanging="360"/>
+      </w:pPr>
+      <w:rPr>
+        <w:rFonts w:ascii="Wingdings" w:hAnsi="Wingdings" w:hint="default"/>
+        <w:sz w:val="20"/>
+      </w:rPr>
+    </w:lvl>
+    <w:lvl w:ilvl="3" w:tentative="1">
+      <w:start w:val="1"/>
+      <w:numFmt w:val="bullet"/>
+      <w:lvlText w:val=""/>
+      <w:lvlJc w:val="left"/>
+      <w:pPr>
+        <w:tabs>
+          <w:tab w:val="num" w:pos="2880"/>
+        </w:tabs>
+        <w:ind w:left="2880" w:hanging="360"/>
+      </w:pPr>
+      <w:rPr>
+        <w:rFonts w:ascii="Wingdings" w:hAnsi="Wingdings" w:hint="default"/>
+        <w:sz w:val="20"/>
+      </w:rPr>
+    </w:lvl>
+    <w:lvl w:ilvl="4" w:tentative="1">
+      <w:start w:val="1"/>
+      <w:numFmt w:val="bullet"/>
+      <w:lvlText w:val=""/>
+      <w:lvlJc w:val="left"/>
+      <w:pPr>
+        <w:tabs>
+          <w:tab w:val="num" w:pos="3600"/>
+        </w:tabs>
+        <w:ind w:left="3600" w:hanging="360"/>
+      </w:pPr>
+      <w:rPr>
+        <w:rFonts w:ascii="Wingdings" w:hAnsi="Wingdings" w:hint="default"/>
+        <w:sz w:val="20"/>
+      </w:rPr>
+    </w:lvl>
+    <w:lvl w:ilvl="5" w:tentative="1">
+      <w:start w:val="1"/>
+      <w:numFmt w:val="bullet"/>
+      <w:lvlText w:val=""/>
+      <w:lvlJc w:val="left"/>
+      <w:pPr>
+        <w:tabs>
+          <w:tab w:val="num" w:pos="4320"/>
+        </w:tabs>
+        <w:ind w:left="4320" w:hanging="360"/>
+      </w:pPr>
+      <w:rPr>
+        <w:rFonts w:ascii="Wingdings" w:hAnsi="Wingdings" w:hint="default"/>
+        <w:sz w:val="20"/>
+      </w:rPr>
+    </w:lvl>
+    <w:lvl w:ilvl="6" w:tentative="1">
+      <w:start w:val="1"/>
+      <w:numFmt w:val="bullet"/>
+      <w:lvlText w:val=""/>
+      <w:lvlJc w:val="left"/>
+      <w:pPr>
+        <w:tabs>
+          <w:tab w:val="num" w:pos="5040"/>
+        </w:tabs>
+        <w:ind w:left="5040" w:hanging="360"/>
+      </w:pPr>
+      <w:rPr>
+        <w:rFonts w:ascii="Wingdings" w:hAnsi="Wingdings" w:hint="default"/>
+        <w:sz w:val="20"/>
+      </w:rPr>
+    </w:lvl>
+    <w:lvl w:ilvl="7" w:tentative="1">
+      <w:start w:val="1"/>
+      <w:numFmt w:val="bullet"/>
+      <w:lvlText w:val=""/>
+      <w:lvlJc w:val="left"/>
+      <w:pPr>
+        <w:tabs>
+          <w:tab w:val="num" w:pos="5760"/>
+        </w:tabs>
+        <w:ind w:left="5760" w:hanging="360"/>
+      </w:pPr>
+      <w:rPr>
+        <w:rFonts w:ascii="Wingdings" w:hAnsi="Wingdings" w:hint="default"/>
+        <w:sz w:val="20"/>
+      </w:rPr>
+    </w:lvl>
+    <w:lvl w:ilvl="8" w:tentative="1">
+      <w:start w:val="1"/>
+      <w:numFmt w:val="bullet"/>
+      <w:lvlText w:val=""/>
+      <w:lvlJc w:val="left"/>
+      <w:pPr>
+        <w:tabs>
+          <w:tab w:val="num" w:pos="6480"/>
+        </w:tabs>
+        <w:ind w:left="6480" w:hanging="360"/>
+      </w:pPr>
+      <w:rPr>
+        <w:rFonts w:ascii="Wingdings" w:hAnsi="Wingdings" w:hint="default"/>
+        <w:sz w:val="20"/>
+      </w:rPr>
+    </w:lvl>
+  </w:abstractNum>
+  <w:num w:numId="1" w16cid:durableId="556090770">
+    <w:abstractNumId w:val="3"/>
+  </w:num>
+  <w:num w:numId="2" w16cid:durableId="707947911">
+    <w:abstractNumId w:val="3"/>
     <w:lvlOverride w:ilvl="1">
       <w:lvl w:ilvl="1">
         <w:numFmt w:val="bullet"/>
@@ -965,8 +2137,8 @@
       </w:lvl>
     </w:lvlOverride>
   </w:num>
-  <w:num w:numId="3" w16cid:durableId="1626767215">
-    <w:abstractNumId w:val="0"/>
+  <w:num w:numId="3" w16cid:durableId="1332416475">
+    <w:abstractNumId w:val="3"/>
     <w:lvlOverride w:ilvl="1">
       <w:lvl w:ilvl="1">
         <w:numFmt w:val="bullet"/>
@@ -985,8 +2157,8 @@
       </w:lvl>
     </w:lvlOverride>
   </w:num>
-  <w:num w:numId="4" w16cid:durableId="254677189">
-    <w:abstractNumId w:val="0"/>
+  <w:num w:numId="4" w16cid:durableId="410808235">
+    <w:abstractNumId w:val="3"/>
     <w:lvlOverride w:ilvl="1">
       <w:lvl w:ilvl="1">
         <w:numFmt w:val="bullet"/>
@@ -1005,8 +2177,48 @@
       </w:lvl>
     </w:lvlOverride>
   </w:num>
-  <w:num w:numId="5" w16cid:durableId="618024022">
-    <w:abstractNumId w:val="0"/>
+  <w:num w:numId="5" w16cid:durableId="710611155">
+    <w:abstractNumId w:val="3"/>
+    <w:lvlOverride w:ilvl="1">
+      <w:lvl w:ilvl="1">
+        <w:numFmt w:val="bullet"/>
+        <w:lvlText w:val=""/>
+        <w:lvlJc w:val="left"/>
+        <w:pPr>
+          <w:tabs>
+            <w:tab w:val="num" w:pos="1440"/>
+          </w:tabs>
+          <w:ind w:left="1440" w:hanging="360"/>
+        </w:pPr>
+        <w:rPr>
+          <w:rFonts w:ascii="Symbol" w:hAnsi="Symbol" w:hint="default"/>
+          <w:sz w:val="20"/>
+        </w:rPr>
+      </w:lvl>
+    </w:lvlOverride>
+  </w:num>
+  <w:num w:numId="6" w16cid:durableId="347949465">
+    <w:abstractNumId w:val="3"/>
+    <w:lvlOverride w:ilvl="1">
+      <w:lvl w:ilvl="1">
+        <w:numFmt w:val="bullet"/>
+        <w:lvlText w:val=""/>
+        <w:lvlJc w:val="left"/>
+        <w:pPr>
+          <w:tabs>
+            <w:tab w:val="num" w:pos="1440"/>
+          </w:tabs>
+          <w:ind w:left="1440" w:hanging="360"/>
+        </w:pPr>
+        <w:rPr>
+          <w:rFonts w:ascii="Symbol" w:hAnsi="Symbol" w:hint="default"/>
+          <w:sz w:val="20"/>
+        </w:rPr>
+      </w:lvl>
+    </w:lvlOverride>
+  </w:num>
+  <w:num w:numId="7" w16cid:durableId="929971641">
+    <w:abstractNumId w:val="3"/>
     <w:lvlOverride w:ilvl="2">
       <w:lvl w:ilvl="2">
         <w:numFmt w:val="bullet"/>
@@ -1025,8 +2237,94 @@
       </w:lvl>
     </w:lvlOverride>
   </w:num>
-  <w:num w:numId="6" w16cid:durableId="1599024400">
+  <w:num w:numId="8" w16cid:durableId="1084301532">
+    <w:abstractNumId w:val="3"/>
+    <w:lvlOverride w:ilvl="2">
+      <w:lvl w:ilvl="2">
+        <w:numFmt w:val="bullet"/>
+        <w:lvlText w:val=""/>
+        <w:lvlJc w:val="left"/>
+        <w:pPr>
+          <w:tabs>
+            <w:tab w:val="num" w:pos="2160"/>
+          </w:tabs>
+          <w:ind w:left="2160" w:hanging="360"/>
+        </w:pPr>
+        <w:rPr>
+          <w:rFonts w:ascii="Symbol" w:hAnsi="Symbol" w:hint="default"/>
+          <w:sz w:val="20"/>
+        </w:rPr>
+      </w:lvl>
+    </w:lvlOverride>
+  </w:num>
+  <w:num w:numId="9" w16cid:durableId="896204903">
+    <w:abstractNumId w:val="3"/>
+    <w:lvlOverride w:ilvl="3">
+      <w:lvl w:ilvl="3">
+        <w:numFmt w:val="bullet"/>
+        <w:lvlText w:val=""/>
+        <w:lvlJc w:val="left"/>
+        <w:pPr>
+          <w:tabs>
+            <w:tab w:val="num" w:pos="2880"/>
+          </w:tabs>
+          <w:ind w:left="2880" w:hanging="360"/>
+        </w:pPr>
+        <w:rPr>
+          <w:rFonts w:ascii="Symbol" w:hAnsi="Symbol" w:hint="default"/>
+          <w:sz w:val="20"/>
+        </w:rPr>
+      </w:lvl>
+    </w:lvlOverride>
+  </w:num>
+  <w:num w:numId="10" w16cid:durableId="66735901">
+    <w:abstractNumId w:val="3"/>
+    <w:lvlOverride w:ilvl="2">
+      <w:lvl w:ilvl="2">
+        <w:numFmt w:val="bullet"/>
+        <w:lvlText w:val=""/>
+        <w:lvlJc w:val="left"/>
+        <w:pPr>
+          <w:tabs>
+            <w:tab w:val="num" w:pos="2160"/>
+          </w:tabs>
+          <w:ind w:left="2160" w:hanging="360"/>
+        </w:pPr>
+        <w:rPr>
+          <w:rFonts w:ascii="Symbol" w:hAnsi="Symbol" w:hint="default"/>
+          <w:sz w:val="20"/>
+        </w:rPr>
+      </w:lvl>
+    </w:lvlOverride>
+  </w:num>
+  <w:num w:numId="11" w16cid:durableId="1856307341">
+    <w:abstractNumId w:val="3"/>
+    <w:lvlOverride w:ilvl="2">
+      <w:lvl w:ilvl="2">
+        <w:numFmt w:val="bullet"/>
+        <w:lvlText w:val=""/>
+        <w:lvlJc w:val="left"/>
+        <w:pPr>
+          <w:tabs>
+            <w:tab w:val="num" w:pos="2160"/>
+          </w:tabs>
+          <w:ind w:left="2160" w:hanging="360"/>
+        </w:pPr>
+        <w:rPr>
+          <w:rFonts w:ascii="Symbol" w:hAnsi="Symbol" w:hint="default"/>
+          <w:sz w:val="20"/>
+        </w:rPr>
+      </w:lvl>
+    </w:lvlOverride>
+  </w:num>
+  <w:num w:numId="12" w16cid:durableId="1769502116">
     <w:abstractNumId w:val="0"/>
+  </w:num>
+  <w:num w:numId="13" w16cid:durableId="731735323">
+    <w:abstractNumId w:val="4"/>
+  </w:num>
+  <w:num w:numId="14" w16cid:durableId="803815356">
+    <w:abstractNumId w:val="4"/>
     <w:lvlOverride w:ilvl="1">
       <w:lvl w:ilvl="1">
         <w:numFmt w:val="bullet"/>
@@ -1045,8 +2343,8 @@
       </w:lvl>
     </w:lvlOverride>
   </w:num>
-  <w:num w:numId="7" w16cid:durableId="799344934">
-    <w:abstractNumId w:val="0"/>
+  <w:num w:numId="15" w16cid:durableId="1723214593">
+    <w:abstractNumId w:val="4"/>
     <w:lvlOverride w:ilvl="1">
       <w:lvl w:ilvl="1">
         <w:numFmt w:val="bullet"/>
@@ -1065,8 +2363,131 @@
       </w:lvl>
     </w:lvlOverride>
   </w:num>
-  <w:num w:numId="8" w16cid:durableId="1966421330">
-    <w:abstractNumId w:val="0"/>
+  <w:num w:numId="16" w16cid:durableId="325590487">
+    <w:abstractNumId w:val="4"/>
+    <w:lvlOverride w:ilvl="1">
+      <w:lvl w:ilvl="1">
+        <w:numFmt w:val="bullet"/>
+        <w:lvlText w:val=""/>
+        <w:lvlJc w:val="left"/>
+        <w:pPr>
+          <w:tabs>
+            <w:tab w:val="num" w:pos="1440"/>
+          </w:tabs>
+          <w:ind w:left="1440" w:hanging="360"/>
+        </w:pPr>
+        <w:rPr>
+          <w:rFonts w:ascii="Symbol" w:hAnsi="Symbol" w:hint="default"/>
+          <w:sz w:val="20"/>
+        </w:rPr>
+      </w:lvl>
+    </w:lvlOverride>
+  </w:num>
+  <w:num w:numId="17" w16cid:durableId="373120819">
+    <w:abstractNumId w:val="4"/>
+    <w:lvlOverride w:ilvl="1">
+      <w:lvl w:ilvl="1">
+        <w:numFmt w:val="bullet"/>
+        <w:lvlText w:val=""/>
+        <w:lvlJc w:val="left"/>
+        <w:pPr>
+          <w:tabs>
+            <w:tab w:val="num" w:pos="1440"/>
+          </w:tabs>
+          <w:ind w:left="1440" w:hanging="360"/>
+        </w:pPr>
+        <w:rPr>
+          <w:rFonts w:ascii="Symbol" w:hAnsi="Symbol" w:hint="default"/>
+          <w:sz w:val="20"/>
+        </w:rPr>
+      </w:lvl>
+    </w:lvlOverride>
+  </w:num>
+  <w:num w:numId="18" w16cid:durableId="480001941">
+    <w:abstractNumId w:val="2"/>
+  </w:num>
+  <w:num w:numId="19" w16cid:durableId="1432386114">
+    <w:abstractNumId w:val="2"/>
+    <w:lvlOverride w:ilvl="1">
+      <w:lvl w:ilvl="1">
+        <w:numFmt w:val="bullet"/>
+        <w:lvlText w:val=""/>
+        <w:lvlJc w:val="left"/>
+        <w:pPr>
+          <w:tabs>
+            <w:tab w:val="num" w:pos="1440"/>
+          </w:tabs>
+          <w:ind w:left="1440" w:hanging="360"/>
+        </w:pPr>
+        <w:rPr>
+          <w:rFonts w:ascii="Symbol" w:hAnsi="Symbol" w:hint="default"/>
+          <w:sz w:val="20"/>
+        </w:rPr>
+      </w:lvl>
+    </w:lvlOverride>
+  </w:num>
+  <w:num w:numId="20" w16cid:durableId="1561483398">
+    <w:abstractNumId w:val="2"/>
+    <w:lvlOverride w:ilvl="1">
+      <w:lvl w:ilvl="1">
+        <w:numFmt w:val="bullet"/>
+        <w:lvlText w:val=""/>
+        <w:lvlJc w:val="left"/>
+        <w:pPr>
+          <w:tabs>
+            <w:tab w:val="num" w:pos="1440"/>
+          </w:tabs>
+          <w:ind w:left="1440" w:hanging="360"/>
+        </w:pPr>
+        <w:rPr>
+          <w:rFonts w:ascii="Symbol" w:hAnsi="Symbol" w:hint="default"/>
+          <w:sz w:val="20"/>
+        </w:rPr>
+      </w:lvl>
+    </w:lvlOverride>
+  </w:num>
+  <w:num w:numId="21" w16cid:durableId="306588961">
+    <w:abstractNumId w:val="2"/>
+    <w:lvlOverride w:ilvl="1">
+      <w:lvl w:ilvl="1">
+        <w:numFmt w:val="bullet"/>
+        <w:lvlText w:val=""/>
+        <w:lvlJc w:val="left"/>
+        <w:pPr>
+          <w:tabs>
+            <w:tab w:val="num" w:pos="1440"/>
+          </w:tabs>
+          <w:ind w:left="1440" w:hanging="360"/>
+        </w:pPr>
+        <w:rPr>
+          <w:rFonts w:ascii="Symbol" w:hAnsi="Symbol" w:hint="default"/>
+          <w:sz w:val="20"/>
+        </w:rPr>
+      </w:lvl>
+    </w:lvlOverride>
+  </w:num>
+  <w:num w:numId="22" w16cid:durableId="1743408878">
+    <w:abstractNumId w:val="2"/>
+    <w:lvlOverride w:ilvl="1">
+      <w:lvl w:ilvl="1">
+        <w:numFmt w:val="bullet"/>
+        <w:lvlText w:val=""/>
+        <w:lvlJc w:val="left"/>
+        <w:pPr>
+          <w:tabs>
+            <w:tab w:val="num" w:pos="1440"/>
+          </w:tabs>
+          <w:ind w:left="1440" w:hanging="360"/>
+        </w:pPr>
+        <w:rPr>
+          <w:rFonts w:ascii="Symbol" w:hAnsi="Symbol" w:hint="default"/>
+          <w:sz w:val="20"/>
+        </w:rPr>
+      </w:lvl>
+    </w:lvlOverride>
+  </w:num>
+  <w:num w:numId="23" w16cid:durableId="1509783106">
+    <w:abstractNumId w:val="2"/>
     <w:lvlOverride w:ilvl="2">
       <w:lvl w:ilvl="2">
         <w:numFmt w:val="bullet"/>
@@ -1085,8 +2506,68 @@
       </w:lvl>
     </w:lvlOverride>
   </w:num>
-  <w:num w:numId="9" w16cid:durableId="1404985500">
-    <w:abstractNumId w:val="0"/>
+  <w:num w:numId="24" w16cid:durableId="26151986">
+    <w:abstractNumId w:val="2"/>
+    <w:lvlOverride w:ilvl="1">
+      <w:lvl w:ilvl="1">
+        <w:numFmt w:val="bullet"/>
+        <w:lvlText w:val=""/>
+        <w:lvlJc w:val="left"/>
+        <w:pPr>
+          <w:tabs>
+            <w:tab w:val="num" w:pos="1440"/>
+          </w:tabs>
+          <w:ind w:left="1440" w:hanging="360"/>
+        </w:pPr>
+        <w:rPr>
+          <w:rFonts w:ascii="Symbol" w:hAnsi="Symbol" w:hint="default"/>
+          <w:sz w:val="20"/>
+        </w:rPr>
+      </w:lvl>
+    </w:lvlOverride>
+  </w:num>
+  <w:num w:numId="25" w16cid:durableId="1129275479">
+    <w:abstractNumId w:val="2"/>
+    <w:lvlOverride w:ilvl="1">
+      <w:lvl w:ilvl="1">
+        <w:numFmt w:val="bullet"/>
+        <w:lvlText w:val=""/>
+        <w:lvlJc w:val="left"/>
+        <w:pPr>
+          <w:tabs>
+            <w:tab w:val="num" w:pos="1440"/>
+          </w:tabs>
+          <w:ind w:left="1440" w:hanging="360"/>
+        </w:pPr>
+        <w:rPr>
+          <w:rFonts w:ascii="Symbol" w:hAnsi="Symbol" w:hint="default"/>
+          <w:sz w:val="20"/>
+        </w:rPr>
+      </w:lvl>
+    </w:lvlOverride>
+  </w:num>
+  <w:num w:numId="26" w16cid:durableId="1889602955">
+    <w:abstractNumId w:val="2"/>
+    <w:lvlOverride w:ilvl="2">
+      <w:lvl w:ilvl="2">
+        <w:numFmt w:val="bullet"/>
+        <w:lvlText w:val=""/>
+        <w:lvlJc w:val="left"/>
+        <w:pPr>
+          <w:tabs>
+            <w:tab w:val="num" w:pos="2160"/>
+          </w:tabs>
+          <w:ind w:left="2160" w:hanging="360"/>
+        </w:pPr>
+        <w:rPr>
+          <w:rFonts w:ascii="Symbol" w:hAnsi="Symbol" w:hint="default"/>
+          <w:sz w:val="20"/>
+        </w:rPr>
+      </w:lvl>
+    </w:lvlOverride>
+  </w:num>
+  <w:num w:numId="27" w16cid:durableId="945774600">
+    <w:abstractNumId w:val="2"/>
     <w:lvlOverride w:ilvl="3">
       <w:lvl w:ilvl="3">
         <w:numFmt w:val="bullet"/>
@@ -1105,8 +2586,8 @@
       </w:lvl>
     </w:lvlOverride>
   </w:num>
-  <w:num w:numId="10" w16cid:durableId="32585137">
-    <w:abstractNumId w:val="0"/>
+  <w:num w:numId="28" w16cid:durableId="1448348670">
+    <w:abstractNumId w:val="2"/>
     <w:lvlOverride w:ilvl="3">
       <w:lvl w:ilvl="3">
         <w:numFmt w:val="bullet"/>
@@ -1125,8 +2606,28 @@
       </w:lvl>
     </w:lvlOverride>
   </w:num>
-  <w:num w:numId="11" w16cid:durableId="368340104">
-    <w:abstractNumId w:val="0"/>
+  <w:num w:numId="29" w16cid:durableId="646670974">
+    <w:abstractNumId w:val="2"/>
+    <w:lvlOverride w:ilvl="3">
+      <w:lvl w:ilvl="3">
+        <w:numFmt w:val="bullet"/>
+        <w:lvlText w:val=""/>
+        <w:lvlJc w:val="left"/>
+        <w:pPr>
+          <w:tabs>
+            <w:tab w:val="num" w:pos="2880"/>
+          </w:tabs>
+          <w:ind w:left="2880" w:hanging="360"/>
+        </w:pPr>
+        <w:rPr>
+          <w:rFonts w:ascii="Symbol" w:hAnsi="Symbol" w:hint="default"/>
+          <w:sz w:val="20"/>
+        </w:rPr>
+      </w:lvl>
+    </w:lvlOverride>
+  </w:num>
+  <w:num w:numId="30" w16cid:durableId="1483888893">
+    <w:abstractNumId w:val="2"/>
     <w:lvlOverride w:ilvl="2">
       <w:lvl w:ilvl="2">
         <w:numFmt w:val="bullet"/>
@@ -1145,8 +2646,8 @@
       </w:lvl>
     </w:lvlOverride>
   </w:num>
-  <w:num w:numId="12" w16cid:durableId="75635430">
-    <w:abstractNumId w:val="0"/>
+  <w:num w:numId="31" w16cid:durableId="1682731196">
+    <w:abstractNumId w:val="2"/>
     <w:lvlOverride w:ilvl="3">
       <w:lvl w:ilvl="3">
         <w:numFmt w:val="bullet"/>
@@ -1165,8 +2666,8 @@
       </w:lvl>
     </w:lvlOverride>
   </w:num>
-  <w:num w:numId="13" w16cid:durableId="308487227">
-    <w:abstractNumId w:val="0"/>
+  <w:num w:numId="32" w16cid:durableId="214315772">
+    <w:abstractNumId w:val="2"/>
     <w:lvlOverride w:ilvl="3">
       <w:lvl w:ilvl="3">
         <w:numFmt w:val="bullet"/>
@@ -1185,8 +2686,68 @@
       </w:lvl>
     </w:lvlOverride>
   </w:num>
-  <w:num w:numId="14" w16cid:durableId="445193635">
-    <w:abstractNumId w:val="0"/>
+  <w:num w:numId="33" w16cid:durableId="538009854">
+    <w:abstractNumId w:val="2"/>
+    <w:lvlOverride w:ilvl="3">
+      <w:lvl w:ilvl="3">
+        <w:numFmt w:val="bullet"/>
+        <w:lvlText w:val=""/>
+        <w:lvlJc w:val="left"/>
+        <w:pPr>
+          <w:tabs>
+            <w:tab w:val="num" w:pos="2880"/>
+          </w:tabs>
+          <w:ind w:left="2880" w:hanging="360"/>
+        </w:pPr>
+        <w:rPr>
+          <w:rFonts w:ascii="Symbol" w:hAnsi="Symbol" w:hint="default"/>
+          <w:sz w:val="20"/>
+        </w:rPr>
+      </w:lvl>
+    </w:lvlOverride>
+  </w:num>
+  <w:num w:numId="34" w16cid:durableId="1415202990">
+    <w:abstractNumId w:val="2"/>
+    <w:lvlOverride w:ilvl="3">
+      <w:lvl w:ilvl="3">
+        <w:numFmt w:val="bullet"/>
+        <w:lvlText w:val=""/>
+        <w:lvlJc w:val="left"/>
+        <w:pPr>
+          <w:tabs>
+            <w:tab w:val="num" w:pos="2880"/>
+          </w:tabs>
+          <w:ind w:left="2880" w:hanging="360"/>
+        </w:pPr>
+        <w:rPr>
+          <w:rFonts w:ascii="Symbol" w:hAnsi="Symbol" w:hint="default"/>
+          <w:sz w:val="20"/>
+        </w:rPr>
+      </w:lvl>
+    </w:lvlOverride>
+  </w:num>
+  <w:num w:numId="35" w16cid:durableId="417679736">
+    <w:abstractNumId w:val="2"/>
+    <w:lvlOverride w:ilvl="3">
+      <w:lvl w:ilvl="3">
+        <w:numFmt w:val="bullet"/>
+        <w:lvlText w:val=""/>
+        <w:lvlJc w:val="left"/>
+        <w:pPr>
+          <w:tabs>
+            <w:tab w:val="num" w:pos="2880"/>
+          </w:tabs>
+          <w:ind w:left="2880" w:hanging="360"/>
+        </w:pPr>
+        <w:rPr>
+          <w:rFonts w:ascii="Symbol" w:hAnsi="Symbol" w:hint="default"/>
+          <w:sz w:val="20"/>
+        </w:rPr>
+      </w:lvl>
+    </w:lvlOverride>
+  </w:num>
+  <w:num w:numId="36" w16cid:durableId="1628200179">
+    <w:abstractNumId w:val="2"/>
     <w:lvlOverride w:ilvl="2">
       <w:lvl w:ilvl="2">
         <w:numFmt w:val="bullet"/>
@@ -1205,8 +2766,8 @@
       </w:lvl>
     </w:lvlOverride>
   </w:num>
-  <w:num w:numId="15" w16cid:durableId="1856769844">
-    <w:abstractNumId w:val="0"/>
+  <w:num w:numId="37" w16cid:durableId="1005978395">
+    <w:abstractNumId w:val="2"/>
     <w:lvlOverride w:ilvl="3">
       <w:lvl w:ilvl="3">
         <w:numFmt w:val="bullet"/>
@@ -1225,8 +2786,8 @@
       </w:lvl>
     </w:lvlOverride>
   </w:num>
-  <w:num w:numId="16" w16cid:durableId="302852254">
-    <w:abstractNumId w:val="0"/>
+  <w:num w:numId="38" w16cid:durableId="1112894947">
+    <w:abstractNumId w:val="2"/>
     <w:lvlOverride w:ilvl="3">
       <w:lvl w:ilvl="3">
         <w:numFmt w:val="bullet"/>
@@ -1245,8 +2806,28 @@
       </w:lvl>
     </w:lvlOverride>
   </w:num>
-  <w:num w:numId="17" w16cid:durableId="169301266">
-    <w:abstractNumId w:val="0"/>
+  <w:num w:numId="39" w16cid:durableId="1231964670">
+    <w:abstractNumId w:val="2"/>
+    <w:lvlOverride w:ilvl="3">
+      <w:lvl w:ilvl="3">
+        <w:numFmt w:val="bullet"/>
+        <w:lvlText w:val=""/>
+        <w:lvlJc w:val="left"/>
+        <w:pPr>
+          <w:tabs>
+            <w:tab w:val="num" w:pos="2880"/>
+          </w:tabs>
+          <w:ind w:left="2880" w:hanging="360"/>
+        </w:pPr>
+        <w:rPr>
+          <w:rFonts w:ascii="Symbol" w:hAnsi="Symbol" w:hint="default"/>
+          <w:sz w:val="20"/>
+        </w:rPr>
+      </w:lvl>
+    </w:lvlOverride>
+  </w:num>
+  <w:num w:numId="40" w16cid:durableId="728116178">
+    <w:abstractNumId w:val="2"/>
     <w:lvlOverride w:ilvl="2">
       <w:lvl w:ilvl="2">
         <w:numFmt w:val="bullet"/>
@@ -1265,8 +2846,8 @@
       </w:lvl>
     </w:lvlOverride>
   </w:num>
-  <w:num w:numId="18" w16cid:durableId="527108814">
-    <w:abstractNumId w:val="0"/>
+  <w:num w:numId="41" w16cid:durableId="348063611">
+    <w:abstractNumId w:val="2"/>
     <w:lvlOverride w:ilvl="3">
       <w:lvl w:ilvl="3">
         <w:numFmt w:val="bullet"/>
@@ -1285,8 +2866,28 @@
       </w:lvl>
     </w:lvlOverride>
   </w:num>
-  <w:num w:numId="19" w16cid:durableId="1519081656">
-    <w:abstractNumId w:val="0"/>
+  <w:num w:numId="42" w16cid:durableId="1766808277">
+    <w:abstractNumId w:val="2"/>
+    <w:lvlOverride w:ilvl="3">
+      <w:lvl w:ilvl="3">
+        <w:numFmt w:val="bullet"/>
+        <w:lvlText w:val=""/>
+        <w:lvlJc w:val="left"/>
+        <w:pPr>
+          <w:tabs>
+            <w:tab w:val="num" w:pos="2880"/>
+          </w:tabs>
+          <w:ind w:left="2880" w:hanging="360"/>
+        </w:pPr>
+        <w:rPr>
+          <w:rFonts w:ascii="Symbol" w:hAnsi="Symbol" w:hint="default"/>
+          <w:sz w:val="20"/>
+        </w:rPr>
+      </w:lvl>
+    </w:lvlOverride>
+  </w:num>
+  <w:num w:numId="43" w16cid:durableId="276718662">
+    <w:abstractNumId w:val="2"/>
     <w:lvlOverride w:ilvl="2">
       <w:lvl w:ilvl="2">
         <w:numFmt w:val="bullet"/>
@@ -1305,8 +2906,8 @@
       </w:lvl>
     </w:lvlOverride>
   </w:num>
-  <w:num w:numId="20" w16cid:durableId="727072041">
-    <w:abstractNumId w:val="0"/>
+  <w:num w:numId="44" w16cid:durableId="1753887190">
+    <w:abstractNumId w:val="2"/>
     <w:lvlOverride w:ilvl="3">
       <w:lvl w:ilvl="3">
         <w:numFmt w:val="bullet"/>
@@ -1325,8 +2926,28 @@
       </w:lvl>
     </w:lvlOverride>
   </w:num>
-  <w:num w:numId="21" w16cid:durableId="1355302995">
-    <w:abstractNumId w:val="0"/>
+  <w:num w:numId="45" w16cid:durableId="2032417440">
+    <w:abstractNumId w:val="2"/>
+    <w:lvlOverride w:ilvl="2">
+      <w:lvl w:ilvl="2">
+        <w:numFmt w:val="bullet"/>
+        <w:lvlText w:val=""/>
+        <w:lvlJc w:val="left"/>
+        <w:pPr>
+          <w:tabs>
+            <w:tab w:val="num" w:pos="2160"/>
+          </w:tabs>
+          <w:ind w:left="2160" w:hanging="360"/>
+        </w:pPr>
+        <w:rPr>
+          <w:rFonts w:ascii="Symbol" w:hAnsi="Symbol" w:hint="default"/>
+          <w:sz w:val="20"/>
+        </w:rPr>
+      </w:lvl>
+    </w:lvlOverride>
+  </w:num>
+  <w:num w:numId="46" w16cid:durableId="1597210304">
+    <w:abstractNumId w:val="2"/>
     <w:lvlOverride w:ilvl="3">
       <w:lvl w:ilvl="3">
         <w:numFmt w:val="bullet"/>
@@ -1345,8 +2966,8 @@
       </w:lvl>
     </w:lvlOverride>
   </w:num>
-  <w:num w:numId="22" w16cid:durableId="1360277572">
-    <w:abstractNumId w:val="0"/>
+  <w:num w:numId="47" w16cid:durableId="2077433553">
+    <w:abstractNumId w:val="2"/>
     <w:lvlOverride w:ilvl="3">
       <w:lvl w:ilvl="3">
         <w:numFmt w:val="bullet"/>
@@ -1365,8 +2986,8 @@
       </w:lvl>
     </w:lvlOverride>
   </w:num>
-  <w:num w:numId="23" w16cid:durableId="68813300">
-    <w:abstractNumId w:val="0"/>
+  <w:num w:numId="48" w16cid:durableId="499345035">
+    <w:abstractNumId w:val="2"/>
     <w:lvlOverride w:ilvl="3">
       <w:lvl w:ilvl="3">
         <w:numFmt w:val="bullet"/>
@@ -1385,8 +3006,28 @@
       </w:lvl>
     </w:lvlOverride>
   </w:num>
-  <w:num w:numId="24" w16cid:durableId="180750571">
-    <w:abstractNumId w:val="0"/>
+  <w:num w:numId="49" w16cid:durableId="1441223558">
+    <w:abstractNumId w:val="2"/>
+    <w:lvlOverride w:ilvl="3">
+      <w:lvl w:ilvl="3">
+        <w:numFmt w:val="bullet"/>
+        <w:lvlText w:val=""/>
+        <w:lvlJc w:val="left"/>
+        <w:pPr>
+          <w:tabs>
+            <w:tab w:val="num" w:pos="2880"/>
+          </w:tabs>
+          <w:ind w:left="2880" w:hanging="360"/>
+        </w:pPr>
+        <w:rPr>
+          <w:rFonts w:ascii="Symbol" w:hAnsi="Symbol" w:hint="default"/>
+          <w:sz w:val="20"/>
+        </w:rPr>
+      </w:lvl>
+    </w:lvlOverride>
+  </w:num>
+  <w:num w:numId="50" w16cid:durableId="1673414830">
+    <w:abstractNumId w:val="2"/>
     <w:lvlOverride w:ilvl="2">
       <w:lvl w:ilvl="2">
         <w:numFmt w:val="bullet"/>
@@ -1405,8 +3046,8 @@
       </w:lvl>
     </w:lvlOverride>
   </w:num>
-  <w:num w:numId="25" w16cid:durableId="55789508">
-    <w:abstractNumId w:val="0"/>
+  <w:num w:numId="51" w16cid:durableId="1311180127">
+    <w:abstractNumId w:val="2"/>
     <w:lvlOverride w:ilvl="3">
       <w:lvl w:ilvl="3">
         <w:numFmt w:val="bullet"/>
@@ -1425,8 +3066,8 @@
       </w:lvl>
     </w:lvlOverride>
   </w:num>
-  <w:num w:numId="26" w16cid:durableId="377508646">
-    <w:abstractNumId w:val="0"/>
+  <w:num w:numId="52" w16cid:durableId="2089306503">
+    <w:abstractNumId w:val="2"/>
     <w:lvlOverride w:ilvl="2">
       <w:lvl w:ilvl="2">
         <w:numFmt w:val="bullet"/>
@@ -1445,28 +3086,214 @@
       </w:lvl>
     </w:lvlOverride>
   </w:num>
-  <w:num w:numId="27" w16cid:durableId="431703924">
-    <w:abstractNumId w:val="0"/>
-    <w:lvlOverride w:ilvl="3">
-      <w:lvl w:ilvl="3">
-        <w:numFmt w:val="bullet"/>
-        <w:lvlText w:val=""/>
-        <w:lvlJc w:val="left"/>
-        <w:pPr>
-          <w:tabs>
-            <w:tab w:val="num" w:pos="2880"/>
-          </w:tabs>
-          <w:ind w:left="2880" w:hanging="360"/>
-        </w:pPr>
-        <w:rPr>
-          <w:rFonts w:ascii="Symbol" w:hAnsi="Symbol" w:hint="default"/>
-          <w:sz w:val="20"/>
-        </w:rPr>
-      </w:lvl>
-    </w:lvlOverride>
-  </w:num>
-  <w:num w:numId="28" w16cid:durableId="41100824">
-    <w:abstractNumId w:val="0"/>
+  <w:num w:numId="53" w16cid:durableId="1302541981">
+    <w:abstractNumId w:val="2"/>
+    <w:lvlOverride w:ilvl="1">
+      <w:lvl w:ilvl="1">
+        <w:numFmt w:val="bullet"/>
+        <w:lvlText w:val=""/>
+        <w:lvlJc w:val="left"/>
+        <w:pPr>
+          <w:tabs>
+            <w:tab w:val="num" w:pos="1440"/>
+          </w:tabs>
+          <w:ind w:left="1440" w:hanging="360"/>
+        </w:pPr>
+        <w:rPr>
+          <w:rFonts w:ascii="Symbol" w:hAnsi="Symbol" w:hint="default"/>
+          <w:sz w:val="20"/>
+        </w:rPr>
+      </w:lvl>
+    </w:lvlOverride>
+  </w:num>
+  <w:num w:numId="54" w16cid:durableId="1671251266">
+    <w:abstractNumId w:val="2"/>
+    <w:lvlOverride w:ilvl="1">
+      <w:lvl w:ilvl="1">
+        <w:numFmt w:val="bullet"/>
+        <w:lvlText w:val=""/>
+        <w:lvlJc w:val="left"/>
+        <w:pPr>
+          <w:tabs>
+            <w:tab w:val="num" w:pos="1440"/>
+          </w:tabs>
+          <w:ind w:left="1440" w:hanging="360"/>
+        </w:pPr>
+        <w:rPr>
+          <w:rFonts w:ascii="Symbol" w:hAnsi="Symbol" w:hint="default"/>
+          <w:sz w:val="20"/>
+        </w:rPr>
+      </w:lvl>
+    </w:lvlOverride>
+  </w:num>
+  <w:num w:numId="55" w16cid:durableId="1094325543">
+    <w:abstractNumId w:val="5"/>
+  </w:num>
+  <w:num w:numId="56" w16cid:durableId="1818955678">
+    <w:abstractNumId w:val="5"/>
+    <w:lvlOverride w:ilvl="1">
+      <w:lvl w:ilvl="1">
+        <w:numFmt w:val="bullet"/>
+        <w:lvlText w:val=""/>
+        <w:lvlJc w:val="left"/>
+        <w:pPr>
+          <w:tabs>
+            <w:tab w:val="num" w:pos="1440"/>
+          </w:tabs>
+          <w:ind w:left="1440" w:hanging="360"/>
+        </w:pPr>
+        <w:rPr>
+          <w:rFonts w:ascii="Symbol" w:hAnsi="Symbol" w:hint="default"/>
+          <w:sz w:val="20"/>
+        </w:rPr>
+      </w:lvl>
+    </w:lvlOverride>
+  </w:num>
+  <w:num w:numId="57" w16cid:durableId="854657539">
+    <w:abstractNumId w:val="1"/>
+  </w:num>
+  <w:num w:numId="58" w16cid:durableId="684288733">
+    <w:abstractNumId w:val="1"/>
+    <w:lvlOverride w:ilvl="1">
+      <w:lvl w:ilvl="1">
+        <w:numFmt w:val="bullet"/>
+        <w:lvlText w:val=""/>
+        <w:lvlJc w:val="left"/>
+        <w:pPr>
+          <w:tabs>
+            <w:tab w:val="num" w:pos="1440"/>
+          </w:tabs>
+          <w:ind w:left="1440" w:hanging="360"/>
+        </w:pPr>
+        <w:rPr>
+          <w:rFonts w:ascii="Symbol" w:hAnsi="Symbol" w:hint="default"/>
+          <w:sz w:val="20"/>
+        </w:rPr>
+      </w:lvl>
+    </w:lvlOverride>
+  </w:num>
+  <w:num w:numId="59" w16cid:durableId="1850483485">
+    <w:abstractNumId w:val="1"/>
+    <w:lvlOverride w:ilvl="1">
+      <w:lvl w:ilvl="1">
+        <w:numFmt w:val="bullet"/>
+        <w:lvlText w:val=""/>
+        <w:lvlJc w:val="left"/>
+        <w:pPr>
+          <w:tabs>
+            <w:tab w:val="num" w:pos="1440"/>
+          </w:tabs>
+          <w:ind w:left="1440" w:hanging="360"/>
+        </w:pPr>
+        <w:rPr>
+          <w:rFonts w:ascii="Symbol" w:hAnsi="Symbol" w:hint="default"/>
+          <w:sz w:val="20"/>
+        </w:rPr>
+      </w:lvl>
+    </w:lvlOverride>
+  </w:num>
+  <w:num w:numId="60" w16cid:durableId="1858150419">
+    <w:abstractNumId w:val="1"/>
+    <w:lvlOverride w:ilvl="1">
+      <w:lvl w:ilvl="1">
+        <w:numFmt w:val="bullet"/>
+        <w:lvlText w:val=""/>
+        <w:lvlJc w:val="left"/>
+        <w:pPr>
+          <w:tabs>
+            <w:tab w:val="num" w:pos="1440"/>
+          </w:tabs>
+          <w:ind w:left="1440" w:hanging="360"/>
+        </w:pPr>
+        <w:rPr>
+          <w:rFonts w:ascii="Symbol" w:hAnsi="Symbol" w:hint="default"/>
+          <w:sz w:val="20"/>
+        </w:rPr>
+      </w:lvl>
+    </w:lvlOverride>
+  </w:num>
+  <w:num w:numId="61" w16cid:durableId="127817539">
+    <w:abstractNumId w:val="1"/>
+    <w:lvlOverride w:ilvl="1">
+      <w:lvl w:ilvl="1">
+        <w:numFmt w:val="bullet"/>
+        <w:lvlText w:val=""/>
+        <w:lvlJc w:val="left"/>
+        <w:pPr>
+          <w:tabs>
+            <w:tab w:val="num" w:pos="1440"/>
+          </w:tabs>
+          <w:ind w:left="1440" w:hanging="360"/>
+        </w:pPr>
+        <w:rPr>
+          <w:rFonts w:ascii="Symbol" w:hAnsi="Symbol" w:hint="default"/>
+          <w:sz w:val="20"/>
+        </w:rPr>
+      </w:lvl>
+    </w:lvlOverride>
+  </w:num>
+  <w:num w:numId="62" w16cid:durableId="2109691330">
+    <w:abstractNumId w:val="1"/>
+    <w:lvlOverride w:ilvl="1">
+      <w:lvl w:ilvl="1">
+        <w:numFmt w:val="bullet"/>
+        <w:lvlText w:val=""/>
+        <w:lvlJc w:val="left"/>
+        <w:pPr>
+          <w:tabs>
+            <w:tab w:val="num" w:pos="1440"/>
+          </w:tabs>
+          <w:ind w:left="1440" w:hanging="360"/>
+        </w:pPr>
+        <w:rPr>
+          <w:rFonts w:ascii="Symbol" w:hAnsi="Symbol" w:hint="default"/>
+          <w:sz w:val="20"/>
+        </w:rPr>
+      </w:lvl>
+    </w:lvlOverride>
+  </w:num>
+  <w:num w:numId="63" w16cid:durableId="364138657">
+    <w:abstractNumId w:val="1"/>
+    <w:lvlOverride w:ilvl="1">
+      <w:lvl w:ilvl="1">
+        <w:numFmt w:val="bullet"/>
+        <w:lvlText w:val=""/>
+        <w:lvlJc w:val="left"/>
+        <w:pPr>
+          <w:tabs>
+            <w:tab w:val="num" w:pos="1440"/>
+          </w:tabs>
+          <w:ind w:left="1440" w:hanging="360"/>
+        </w:pPr>
+        <w:rPr>
+          <w:rFonts w:ascii="Symbol" w:hAnsi="Symbol" w:hint="default"/>
+          <w:sz w:val="20"/>
+        </w:rPr>
+      </w:lvl>
+    </w:lvlOverride>
+  </w:num>
+  <w:num w:numId="64" w16cid:durableId="1780753794">
+    <w:abstractNumId w:val="1"/>
+    <w:lvlOverride w:ilvl="1">
+      <w:lvl w:ilvl="1">
+        <w:numFmt w:val="bullet"/>
+        <w:lvlText w:val=""/>
+        <w:lvlJc w:val="left"/>
+        <w:pPr>
+          <w:tabs>
+            <w:tab w:val="num" w:pos="1440"/>
+          </w:tabs>
+          <w:ind w:left="1440" w:hanging="360"/>
+        </w:pPr>
+        <w:rPr>
+          <w:rFonts w:ascii="Symbol" w:hAnsi="Symbol" w:hint="default"/>
+          <w:sz w:val="20"/>
+        </w:rPr>
+      </w:lvl>
+    </w:lvlOverride>
+  </w:num>
+  <w:num w:numId="65" w16cid:durableId="1915046235">
+    <w:abstractNumId w:val="1"/>
     <w:lvlOverride w:ilvl="2">
       <w:lvl w:ilvl="2">
         <w:numFmt w:val="bullet"/>
@@ -1485,408 +3312,8 @@
       </w:lvl>
     </w:lvlOverride>
   </w:num>
-  <w:num w:numId="29" w16cid:durableId="444816525">
-    <w:abstractNumId w:val="0"/>
-    <w:lvlOverride w:ilvl="3">
-      <w:lvl w:ilvl="3">
-        <w:numFmt w:val="bullet"/>
-        <w:lvlText w:val=""/>
-        <w:lvlJc w:val="left"/>
-        <w:pPr>
-          <w:tabs>
-            <w:tab w:val="num" w:pos="2880"/>
-          </w:tabs>
-          <w:ind w:left="2880" w:hanging="360"/>
-        </w:pPr>
-        <w:rPr>
-          <w:rFonts w:ascii="Symbol" w:hAnsi="Symbol" w:hint="default"/>
-          <w:sz w:val="20"/>
-        </w:rPr>
-      </w:lvl>
-    </w:lvlOverride>
-  </w:num>
-  <w:num w:numId="30" w16cid:durableId="207880659">
-    <w:abstractNumId w:val="0"/>
-    <w:lvlOverride w:ilvl="3">
-      <w:lvl w:ilvl="3">
-        <w:numFmt w:val="bullet"/>
-        <w:lvlText w:val=""/>
-        <w:lvlJc w:val="left"/>
-        <w:pPr>
-          <w:tabs>
-            <w:tab w:val="num" w:pos="2880"/>
-          </w:tabs>
-          <w:ind w:left="2880" w:hanging="360"/>
-        </w:pPr>
-        <w:rPr>
-          <w:rFonts w:ascii="Symbol" w:hAnsi="Symbol" w:hint="default"/>
-          <w:sz w:val="20"/>
-        </w:rPr>
-      </w:lvl>
-    </w:lvlOverride>
-  </w:num>
-  <w:num w:numId="31" w16cid:durableId="424889171">
-    <w:abstractNumId w:val="0"/>
-    <w:lvlOverride w:ilvl="3">
-      <w:lvl w:ilvl="3">
-        <w:numFmt w:val="bullet"/>
-        <w:lvlText w:val=""/>
-        <w:lvlJc w:val="left"/>
-        <w:pPr>
-          <w:tabs>
-            <w:tab w:val="num" w:pos="2880"/>
-          </w:tabs>
-          <w:ind w:left="2880" w:hanging="360"/>
-        </w:pPr>
-        <w:rPr>
-          <w:rFonts w:ascii="Symbol" w:hAnsi="Symbol" w:hint="default"/>
-          <w:sz w:val="20"/>
-        </w:rPr>
-      </w:lvl>
-    </w:lvlOverride>
-  </w:num>
-  <w:num w:numId="32" w16cid:durableId="1616055043">
-    <w:abstractNumId w:val="0"/>
-    <w:lvlOverride w:ilvl="3">
-      <w:lvl w:ilvl="3">
-        <w:numFmt w:val="bullet"/>
-        <w:lvlText w:val=""/>
-        <w:lvlJc w:val="left"/>
-        <w:pPr>
-          <w:tabs>
-            <w:tab w:val="num" w:pos="2880"/>
-          </w:tabs>
-          <w:ind w:left="2880" w:hanging="360"/>
-        </w:pPr>
-        <w:rPr>
-          <w:rFonts w:ascii="Symbol" w:hAnsi="Symbol" w:hint="default"/>
-          <w:sz w:val="20"/>
-        </w:rPr>
-      </w:lvl>
-    </w:lvlOverride>
-  </w:num>
-  <w:num w:numId="33" w16cid:durableId="981615856">
-    <w:abstractNumId w:val="0"/>
-    <w:lvlOverride w:ilvl="1">
-      <w:lvl w:ilvl="1">
-        <w:numFmt w:val="bullet"/>
-        <w:lvlText w:val=""/>
-        <w:lvlJc w:val="left"/>
-        <w:pPr>
-          <w:tabs>
-            <w:tab w:val="num" w:pos="1440"/>
-          </w:tabs>
-          <w:ind w:left="1440" w:hanging="360"/>
-        </w:pPr>
-        <w:rPr>
-          <w:rFonts w:ascii="Symbol" w:hAnsi="Symbol" w:hint="default"/>
-          <w:sz w:val="20"/>
-        </w:rPr>
-      </w:lvl>
-    </w:lvlOverride>
-  </w:num>
-  <w:num w:numId="34" w16cid:durableId="491794398">
-    <w:abstractNumId w:val="0"/>
-    <w:lvlOverride w:ilvl="1">
-      <w:lvl w:ilvl="1">
-        <w:numFmt w:val="bullet"/>
-        <w:lvlText w:val=""/>
-        <w:lvlJc w:val="left"/>
-        <w:pPr>
-          <w:tabs>
-            <w:tab w:val="num" w:pos="1440"/>
-          </w:tabs>
-          <w:ind w:left="1440" w:hanging="360"/>
-        </w:pPr>
-        <w:rPr>
-          <w:rFonts w:ascii="Symbol" w:hAnsi="Symbol" w:hint="default"/>
-          <w:sz w:val="20"/>
-        </w:rPr>
-      </w:lvl>
-    </w:lvlOverride>
-  </w:num>
-  <w:num w:numId="35" w16cid:durableId="1326319286">
-    <w:abstractNumId w:val="0"/>
-    <w:lvlOverride w:ilvl="1">
-      <w:lvl w:ilvl="1">
-        <w:numFmt w:val="bullet"/>
-        <w:lvlText w:val=""/>
-        <w:lvlJc w:val="left"/>
-        <w:pPr>
-          <w:tabs>
-            <w:tab w:val="num" w:pos="1440"/>
-          </w:tabs>
-          <w:ind w:left="1440" w:hanging="360"/>
-        </w:pPr>
-        <w:rPr>
-          <w:rFonts w:ascii="Symbol" w:hAnsi="Symbol" w:hint="default"/>
-          <w:sz w:val="20"/>
-        </w:rPr>
-      </w:lvl>
-    </w:lvlOverride>
-  </w:num>
-  <w:num w:numId="36" w16cid:durableId="843016617">
-    <w:abstractNumId w:val="0"/>
-    <w:lvlOverride w:ilvl="1">
-      <w:lvl w:ilvl="1">
-        <w:numFmt w:val="bullet"/>
-        <w:lvlText w:val=""/>
-        <w:lvlJc w:val="left"/>
-        <w:pPr>
-          <w:tabs>
-            <w:tab w:val="num" w:pos="1440"/>
-          </w:tabs>
-          <w:ind w:left="1440" w:hanging="360"/>
-        </w:pPr>
-        <w:rPr>
-          <w:rFonts w:ascii="Symbol" w:hAnsi="Symbol" w:hint="default"/>
-          <w:sz w:val="20"/>
-        </w:rPr>
-      </w:lvl>
-    </w:lvlOverride>
-  </w:num>
-  <w:num w:numId="37" w16cid:durableId="1788088436">
-    <w:abstractNumId w:val="0"/>
-    <w:lvlOverride w:ilvl="1">
-      <w:lvl w:ilvl="1">
-        <w:numFmt w:val="bullet"/>
-        <w:lvlText w:val=""/>
-        <w:lvlJc w:val="left"/>
-        <w:pPr>
-          <w:tabs>
-            <w:tab w:val="num" w:pos="1440"/>
-          </w:tabs>
-          <w:ind w:left="1440" w:hanging="360"/>
-        </w:pPr>
-        <w:rPr>
-          <w:rFonts w:ascii="Symbol" w:hAnsi="Symbol" w:hint="default"/>
-          <w:sz w:val="20"/>
-        </w:rPr>
-      </w:lvl>
-    </w:lvlOverride>
-  </w:num>
-  <w:num w:numId="38" w16cid:durableId="1817064113">
-    <w:abstractNumId w:val="0"/>
-    <w:lvlOverride w:ilvl="1">
-      <w:lvl w:ilvl="1">
-        <w:numFmt w:val="bullet"/>
-        <w:lvlText w:val=""/>
-        <w:lvlJc w:val="left"/>
-        <w:pPr>
-          <w:tabs>
-            <w:tab w:val="num" w:pos="1440"/>
-          </w:tabs>
-          <w:ind w:left="1440" w:hanging="360"/>
-        </w:pPr>
-        <w:rPr>
-          <w:rFonts w:ascii="Symbol" w:hAnsi="Symbol" w:hint="default"/>
-          <w:sz w:val="20"/>
-        </w:rPr>
-      </w:lvl>
-    </w:lvlOverride>
-  </w:num>
-  <w:num w:numId="39" w16cid:durableId="1108282397">
-    <w:abstractNumId w:val="0"/>
-    <w:lvlOverride w:ilvl="1">
-      <w:lvl w:ilvl="1">
-        <w:numFmt w:val="bullet"/>
-        <w:lvlText w:val=""/>
-        <w:lvlJc w:val="left"/>
-        <w:pPr>
-          <w:tabs>
-            <w:tab w:val="num" w:pos="1440"/>
-          </w:tabs>
-          <w:ind w:left="1440" w:hanging="360"/>
-        </w:pPr>
-        <w:rPr>
-          <w:rFonts w:ascii="Symbol" w:hAnsi="Symbol" w:hint="default"/>
-          <w:sz w:val="20"/>
-        </w:rPr>
-      </w:lvl>
-    </w:lvlOverride>
-  </w:num>
-  <w:num w:numId="40" w16cid:durableId="208759442">
-    <w:abstractNumId w:val="0"/>
-    <w:lvlOverride w:ilvl="1">
-      <w:lvl w:ilvl="1">
-        <w:numFmt w:val="bullet"/>
-        <w:lvlText w:val=""/>
-        <w:lvlJc w:val="left"/>
-        <w:pPr>
-          <w:tabs>
-            <w:tab w:val="num" w:pos="1440"/>
-          </w:tabs>
-          <w:ind w:left="1440" w:hanging="360"/>
-        </w:pPr>
-        <w:rPr>
-          <w:rFonts w:ascii="Symbol" w:hAnsi="Symbol" w:hint="default"/>
-          <w:sz w:val="20"/>
-        </w:rPr>
-      </w:lvl>
-    </w:lvlOverride>
-  </w:num>
-  <w:num w:numId="41" w16cid:durableId="1108617965">
-    <w:abstractNumId w:val="0"/>
-    <w:lvlOverride w:ilvl="1">
-      <w:lvl w:ilvl="1">
-        <w:numFmt w:val="bullet"/>
-        <w:lvlText w:val=""/>
-        <w:lvlJc w:val="left"/>
-        <w:pPr>
-          <w:tabs>
-            <w:tab w:val="num" w:pos="1440"/>
-          </w:tabs>
-          <w:ind w:left="1440" w:hanging="360"/>
-        </w:pPr>
-        <w:rPr>
-          <w:rFonts w:ascii="Symbol" w:hAnsi="Symbol" w:hint="default"/>
-          <w:sz w:val="20"/>
-        </w:rPr>
-      </w:lvl>
-    </w:lvlOverride>
-  </w:num>
-  <w:num w:numId="42" w16cid:durableId="1214197601">
-    <w:abstractNumId w:val="0"/>
-    <w:lvlOverride w:ilvl="1">
-      <w:lvl w:ilvl="1">
-        <w:numFmt w:val="bullet"/>
-        <w:lvlText w:val=""/>
-        <w:lvlJc w:val="left"/>
-        <w:pPr>
-          <w:tabs>
-            <w:tab w:val="num" w:pos="1440"/>
-          </w:tabs>
-          <w:ind w:left="1440" w:hanging="360"/>
-        </w:pPr>
-        <w:rPr>
-          <w:rFonts w:ascii="Symbol" w:hAnsi="Symbol" w:hint="default"/>
-          <w:sz w:val="20"/>
-        </w:rPr>
-      </w:lvl>
-    </w:lvlOverride>
-  </w:num>
-  <w:num w:numId="43" w16cid:durableId="1947957745">
-    <w:abstractNumId w:val="0"/>
-    <w:lvlOverride w:ilvl="1">
-      <w:lvl w:ilvl="1">
-        <w:numFmt w:val="bullet"/>
-        <w:lvlText w:val=""/>
-        <w:lvlJc w:val="left"/>
-        <w:pPr>
-          <w:tabs>
-            <w:tab w:val="num" w:pos="1440"/>
-          </w:tabs>
-          <w:ind w:left="1440" w:hanging="360"/>
-        </w:pPr>
-        <w:rPr>
-          <w:rFonts w:ascii="Symbol" w:hAnsi="Symbol" w:hint="default"/>
-          <w:sz w:val="20"/>
-        </w:rPr>
-      </w:lvl>
-    </w:lvlOverride>
-  </w:num>
-  <w:num w:numId="44" w16cid:durableId="1476873773">
-    <w:abstractNumId w:val="0"/>
-    <w:lvlOverride w:ilvl="1">
-      <w:lvl w:ilvl="1">
-        <w:numFmt w:val="bullet"/>
-        <w:lvlText w:val=""/>
-        <w:lvlJc w:val="left"/>
-        <w:pPr>
-          <w:tabs>
-            <w:tab w:val="num" w:pos="1440"/>
-          </w:tabs>
-          <w:ind w:left="1440" w:hanging="360"/>
-        </w:pPr>
-        <w:rPr>
-          <w:rFonts w:ascii="Symbol" w:hAnsi="Symbol" w:hint="default"/>
-          <w:sz w:val="20"/>
-        </w:rPr>
-      </w:lvl>
-    </w:lvlOverride>
-  </w:num>
-  <w:num w:numId="45" w16cid:durableId="866942610">
-    <w:abstractNumId w:val="0"/>
-    <w:lvlOverride w:ilvl="1">
-      <w:lvl w:ilvl="1">
-        <w:numFmt w:val="bullet"/>
-        <w:lvlText w:val=""/>
-        <w:lvlJc w:val="left"/>
-        <w:pPr>
-          <w:tabs>
-            <w:tab w:val="num" w:pos="1440"/>
-          </w:tabs>
-          <w:ind w:left="1440" w:hanging="360"/>
-        </w:pPr>
-        <w:rPr>
-          <w:rFonts w:ascii="Symbol" w:hAnsi="Symbol" w:hint="default"/>
-          <w:sz w:val="20"/>
-        </w:rPr>
-      </w:lvl>
-    </w:lvlOverride>
-  </w:num>
-  <w:num w:numId="46" w16cid:durableId="1544518380">
-    <w:abstractNumId w:val="0"/>
-    <w:lvlOverride w:ilvl="1">
-      <w:lvl w:ilvl="1">
-        <w:numFmt w:val="bullet"/>
-        <w:lvlText w:val=""/>
-        <w:lvlJc w:val="left"/>
-        <w:pPr>
-          <w:tabs>
-            <w:tab w:val="num" w:pos="1440"/>
-          </w:tabs>
-          <w:ind w:left="1440" w:hanging="360"/>
-        </w:pPr>
-        <w:rPr>
-          <w:rFonts w:ascii="Symbol" w:hAnsi="Symbol" w:hint="default"/>
-          <w:sz w:val="20"/>
-        </w:rPr>
-      </w:lvl>
-    </w:lvlOverride>
-  </w:num>
-  <w:num w:numId="47" w16cid:durableId="2144303792">
-    <w:abstractNumId w:val="0"/>
-    <w:lvlOverride w:ilvl="1">
-      <w:lvl w:ilvl="1">
-        <w:numFmt w:val="bullet"/>
-        <w:lvlText w:val=""/>
-        <w:lvlJc w:val="left"/>
-        <w:pPr>
-          <w:tabs>
-            <w:tab w:val="num" w:pos="1440"/>
-          </w:tabs>
-          <w:ind w:left="1440" w:hanging="360"/>
-        </w:pPr>
-        <w:rPr>
-          <w:rFonts w:ascii="Symbol" w:hAnsi="Symbol" w:hint="default"/>
-          <w:sz w:val="20"/>
-        </w:rPr>
-      </w:lvl>
-    </w:lvlOverride>
-  </w:num>
-  <w:num w:numId="48" w16cid:durableId="1775901115">
-    <w:abstractNumId w:val="0"/>
-    <w:lvlOverride w:ilvl="1">
-      <w:lvl w:ilvl="1">
-        <w:numFmt w:val="bullet"/>
-        <w:lvlText w:val=""/>
-        <w:lvlJc w:val="left"/>
-        <w:pPr>
-          <w:tabs>
-            <w:tab w:val="num" w:pos="1440"/>
-          </w:tabs>
-          <w:ind w:left="1440" w:hanging="360"/>
-        </w:pPr>
-        <w:rPr>
-          <w:rFonts w:ascii="Symbol" w:hAnsi="Symbol" w:hint="default"/>
-          <w:sz w:val="20"/>
-        </w:rPr>
-      </w:lvl>
-    </w:lvlOverride>
-  </w:num>
-  <w:num w:numId="49" w16cid:durableId="821000957">
-    <w:abstractNumId w:val="0"/>
+  <w:num w:numId="66" w16cid:durableId="1775055868">
+    <w:abstractNumId w:val="1"/>
     <w:lvlOverride w:ilvl="2">
       <w:lvl w:ilvl="2">
         <w:numFmt w:val="bullet"/>
@@ -1905,26 +3332,7 @@
       </w:lvl>
     </w:lvlOverride>
   </w:num>
-  <w:num w:numId="50" w16cid:durableId="2973443">
-    <w:abstractNumId w:val="0"/>
-    <w:lvlOverride w:ilvl="2">
-      <w:lvl w:ilvl="2">
-        <w:numFmt w:val="bullet"/>
-        <w:lvlText w:val=""/>
-        <w:lvlJc w:val="left"/>
-        <w:pPr>
-          <w:tabs>
-            <w:tab w:val="num" w:pos="2160"/>
-          </w:tabs>
-          <w:ind w:left="2160" w:hanging="360"/>
-        </w:pPr>
-        <w:rPr>
-          <w:rFonts w:ascii="Symbol" w:hAnsi="Symbol" w:hint="default"/>
-          <w:sz w:val="20"/>
-        </w:rPr>
-      </w:lvl>
-    </w:lvlOverride>
-  </w:num>
+  <w:numIdMacAtCleanup w:val="66"/>
 </w:numbering>
 </file>
 

</xml_diff>